<commit_message>
# Teste de performance com K6 - fixture de dados
Adicionado fixture para os dados de entrada
</commit_message>
<xml_diff>
--- a/Modulo_5_Testes_De_Performance/Desafio - Resumo modulo 5 - Teste de Performance.docx
+++ b/Modulo_5_Testes_De_Performance/Desafio - Resumo modulo 5 - Teste de Performance.docx
@@ -3948,6 +3948,10 @@
     <w:p>
       <w:pPr>
         <w:spacing w:after="0"/>
+        <w:rPr>
+          <w:b/>
+          <w:bCs/>
+        </w:rPr>
       </w:pPr>
       <w:r>
         <w:rPr>
@@ -3956,31 +3960,1186 @@
         </w:rPr>
         <w:t xml:space="preserve">9. </w:t>
       </w:r>
-    </w:p>
-    <w:p>
-      <w:pPr>
-        <w:spacing w:after="0"/>
-      </w:pPr>
-      <w:r>
-        <w:pict w14:anchorId="5ABC5FA5">
-          <v:rect id="_x0000_i1038" style="width:0;height:1.5pt" o:hralign="center" o:bullet="t" o:hrstd="t" o:hr="t" fillcolor="#a0a0a0" stroked="f"/>
-        </w:pict>
-      </w:r>
-    </w:p>
-    <w:p>
-      <w:pPr>
-        <w:spacing w:after="0"/>
-      </w:pPr>
       <w:r>
         <w:rPr>
           <w:b/>
           <w:bCs/>
         </w:rPr>
+        <w:t>IMPLEMENTANDO THRESHOLDS</w:t>
+      </w:r>
+    </w:p>
+    <w:p>
+      <w:pPr>
+        <w:spacing w:after="0"/>
+        <w:rPr>
+          <w:b/>
+          <w:bCs/>
+        </w:rPr>
+      </w:pPr>
+    </w:p>
+    <w:p>
+      <w:pPr>
+        <w:spacing w:after="0"/>
+      </w:pPr>
+      <w:r>
         <w:lastRenderedPageBreak/>
+        <w:t xml:space="preserve">Vão ajudar. Sejam </w:t>
+      </w:r>
+      <w:proofErr w:type="spellStart"/>
+      <w:r>
+        <w:t>bemvindos</w:t>
+      </w:r>
+      <w:proofErr w:type="spellEnd"/>
+      <w:r>
+        <w:t xml:space="preserve"> à nossa aula sobre </w:t>
+      </w:r>
+      <w:proofErr w:type="spellStart"/>
+      <w:r>
+        <w:t>thresholds</w:t>
+      </w:r>
+      <w:proofErr w:type="spellEnd"/>
+      <w:r>
+        <w:t xml:space="preserve">. Vão ajudar você a colocar validações que, de fato, fazem o teste falhar quando não são obedecidas. Esses são, de fato, a coisa que você mais vai utilizar dentro do dia a dia como sendo alguém que cria testes automatizados. </w:t>
+      </w:r>
+      <w:proofErr w:type="gramStart"/>
+      <w:r>
+        <w:t>Deixa eu</w:t>
+      </w:r>
+      <w:proofErr w:type="gramEnd"/>
+      <w:r>
+        <w:t xml:space="preserve"> te dar exemplo. Eu estou atuando num projeto atualmente, onde eu trabalho como QA Lead e responsável pelos testes de performance. E 1 das principais regras que eles me deram foi que, cada 1 das nossas APIs precisa ter de 3000 milissegundos. O que isso quer dizer? Quer dizer que as APIs têm que responder em até 3 segundos. Então esse é o </w:t>
+      </w:r>
+      <w:proofErr w:type="spellStart"/>
+      <w:r>
+        <w:t>threshold</w:t>
+      </w:r>
+      <w:proofErr w:type="spellEnd"/>
+      <w:r>
+        <w:t xml:space="preserve">. Só que o </w:t>
+      </w:r>
+      <w:proofErr w:type="spellStart"/>
+      <w:r>
+        <w:t>threshold</w:t>
+      </w:r>
+      <w:proofErr w:type="spellEnd"/>
+      <w:r>
+        <w:t xml:space="preserve"> ele não vem apenas com o tempo, porque a gente tem aquelas métricas. Lembra que a gente viu? Média, mediana, mínimo, máximo, </w:t>
+      </w:r>
+      <w:proofErr w:type="spellStart"/>
+      <w:r>
+        <w:t>etcétera</w:t>
+      </w:r>
+      <w:proofErr w:type="spellEnd"/>
+      <w:r>
+        <w:t xml:space="preserve">. Então, geralmente o </w:t>
+      </w:r>
+      <w:proofErr w:type="spellStart"/>
+      <w:r>
+        <w:t>threshold</w:t>
+      </w:r>
+      <w:proofErr w:type="spellEnd"/>
+      <w:r>
+        <w:t xml:space="preserve"> está relacionado a 1 delas. Então, quando eu falo desses 3000 milissegundos lá nesse projeto onde eu estou, a gente considera a métrica do percentil de 95. Ou seja, o percentil de 95 nunca pode estar acima de 3000 milissegundos. Entendeu até aqui? </w:t>
+      </w:r>
+      <w:proofErr w:type="spellStart"/>
+      <w:r>
+        <w:t>Julio</w:t>
+      </w:r>
+      <w:proofErr w:type="spellEnd"/>
+      <w:r>
+        <w:t xml:space="preserve">, como eu consigo essa informação? A partir dos requisitos não funcionais. Nós não temos requisitos não funcionais, você conversa com o seu time e tenta entender ele com o p o ou com o tech lead, qual que é o </w:t>
+      </w:r>
+      <w:proofErr w:type="spellStart"/>
+      <w:r>
+        <w:t>threshold</w:t>
+      </w:r>
+      <w:proofErr w:type="spellEnd"/>
+      <w:r>
+        <w:t xml:space="preserve">, ou seja, o critério de teste de performance pra considerar que aquele teste teve sucesso. Quando esse </w:t>
+      </w:r>
+      <w:proofErr w:type="spellStart"/>
+      <w:r>
+        <w:t>threshold</w:t>
+      </w:r>
+      <w:proofErr w:type="spellEnd"/>
+      <w:r>
+        <w:t xml:space="preserve"> ele é a, ele é ultrapassado, significa que os testes falharam. Entendeu? Beleza, vamos lá então. Que que você precisa conhecer pra que você consiga utilizar os </w:t>
+      </w:r>
+      <w:proofErr w:type="spellStart"/>
+      <w:r>
+        <w:t>thresholds</w:t>
+      </w:r>
+      <w:proofErr w:type="spellEnd"/>
+      <w:r>
+        <w:t xml:space="preserve">? 1º você precisa conhecer quais são eles, né? Ou seja, quais são os critérios que você tem como sendo parte do da do </w:t>
+      </w:r>
+      <w:proofErr w:type="spellStart"/>
+      <w:r>
+        <w:t>do</w:t>
+      </w:r>
+      <w:proofErr w:type="spellEnd"/>
+      <w:r>
+        <w:t xml:space="preserve"> comportamento esperado sobre a perspectiva de performance pra essa API. Então olha só aqui alguns exemplos, olha. Menos de </w:t>
+      </w:r>
+      <w:proofErr w:type="spellStart"/>
+      <w:r>
+        <w:t>por</w:t>
+      </w:r>
+      <w:proofErr w:type="spellEnd"/>
+      <w:r>
+        <w:t xml:space="preserve"> 100 das requisições retornaram erro. 95 por 100 das requisições tiveram tempos abaixo de 200 milissegundos. 99 por 100 das requisições tiveram tempo de resposta menor do que 400. Específico sempre tem que responder em até 300 milissegundos, entende? Então são aqui algumas das métricas que a gente utiliza, alguns dos </w:t>
+      </w:r>
+      <w:proofErr w:type="spellStart"/>
+      <w:r>
+        <w:t>thresholds</w:t>
+      </w:r>
+      <w:proofErr w:type="spellEnd"/>
+      <w:r>
+        <w:t xml:space="preserve">, dos critérios que a gente utiliza pra testar. A implementação disso no código é mega simples, olha só. Lá dentro daquela constante de </w:t>
+      </w:r>
+      <w:proofErr w:type="spellStart"/>
+      <w:r>
+        <w:t>options</w:t>
+      </w:r>
+      <w:proofErr w:type="spellEnd"/>
+      <w:r>
+        <w:t xml:space="preserve">, o que a gente vai fazer é que a gente vai colocar 1 propriedade chamada </w:t>
+      </w:r>
+      <w:proofErr w:type="spellStart"/>
+      <w:r>
+        <w:t>thresholds</w:t>
+      </w:r>
+      <w:proofErr w:type="spellEnd"/>
+      <w:r>
+        <w:t xml:space="preserve">, com 2 pontos, e aí a gente vai ter aqui a abertura de objeto </w:t>
+      </w:r>
+      <w:proofErr w:type="spellStart"/>
+      <w:r>
+        <w:t>JavaScript</w:t>
+      </w:r>
+      <w:proofErr w:type="spellEnd"/>
+      <w:r>
+        <w:t xml:space="preserve">, e nesse objeto, olha o que a gente vai ter, a gente vai ter propriedades que representam as métricas, então isso daqui é igualzinho aquelas métricas que a gente tem lá no k 6, está bom? Vou vir aqui no métricas pra você ver. Vamos descer aqui, olha. Você lembra dessas métricas, olha? HTTP, </w:t>
+      </w:r>
+      <w:proofErr w:type="spellStart"/>
+      <w:r>
+        <w:t>hack</w:t>
+      </w:r>
+      <w:proofErr w:type="spellEnd"/>
+      <w:r>
+        <w:t xml:space="preserve"> </w:t>
+      </w:r>
+      <w:proofErr w:type="spellStart"/>
+      <w:r>
+        <w:t>duration</w:t>
+      </w:r>
+      <w:proofErr w:type="spellEnd"/>
+      <w:r>
+        <w:t xml:space="preserve">, </w:t>
+      </w:r>
+      <w:proofErr w:type="spellStart"/>
+      <w:r>
+        <w:t>hack</w:t>
+      </w:r>
+      <w:proofErr w:type="spellEnd"/>
+      <w:r>
+        <w:t xml:space="preserve"> </w:t>
+      </w:r>
+      <w:proofErr w:type="spellStart"/>
+      <w:r>
+        <w:t>failed</w:t>
+      </w:r>
+      <w:proofErr w:type="spellEnd"/>
+      <w:r>
+        <w:t xml:space="preserve">, </w:t>
+      </w:r>
+      <w:proofErr w:type="spellStart"/>
+      <w:r>
+        <w:t>hack</w:t>
+      </w:r>
+      <w:proofErr w:type="spellEnd"/>
+      <w:r>
+        <w:t xml:space="preserve"> </w:t>
+      </w:r>
+      <w:proofErr w:type="spellStart"/>
+      <w:r>
+        <w:t>requests</w:t>
+      </w:r>
+      <w:proofErr w:type="spellEnd"/>
+      <w:r>
+        <w:t xml:space="preserve">, está vendo? São as métricas. Então, gente pega aqui a métrica, ok? E a gente vai pegar aqui, olha, essas medidas como sendo os nossos os nossos fatores que vão nos ajudar a definir o </w:t>
+      </w:r>
+      <w:proofErr w:type="spellStart"/>
+      <w:r>
+        <w:t>threshold</w:t>
+      </w:r>
+      <w:proofErr w:type="spellEnd"/>
+      <w:r>
+        <w:t xml:space="preserve">. Então, eu venho aqui nesse </w:t>
+      </w:r>
+      <w:proofErr w:type="spellStart"/>
+      <w:r>
+        <w:t>threshold</w:t>
+      </w:r>
+      <w:proofErr w:type="spellEnd"/>
+      <w:r>
+        <w:t xml:space="preserve">, abro aqui, coloco 2 pontos, abro a chave e aqui dentro eu coloco quais são essas métricas. E aí eu coloco 2 pontos, colchete e dentro de aspas simples eu coloco qual é a métrica e qual é o valor esperado pra ela. Olha só, isso daqui está dizendo que a quantidade de erros tem que ser menor que 0.0 isso aqui significa por 100. Logo, 100 por 100 vai ser 0.00, ok? É ou apenas né? Aqui olha, está falando que o percentual de 95 tem que ter o </w:t>
+      </w:r>
+      <w:proofErr w:type="spellStart"/>
+      <w:r>
+        <w:t>o</w:t>
+      </w:r>
+      <w:proofErr w:type="spellEnd"/>
+      <w:r>
+        <w:t xml:space="preserve"> tempo de duração menor do que 200 milissegundos, Ok? É isso daqui que a gente vai ter. Que que a gente vai fazer? A gente vai implementar isso, mas antes, eu quero só ter 100 por 100 de certeza que a sua API está funcionando. Ok? Porque em algumas aulas a gente acaba matando a API, então se a sua não está no ar, faça ela voltar no ar, está bom? Então, aqui a minha ela já está rodando, como que eu sei que ela está rodando, venho aqui no </w:t>
+      </w:r>
+      <w:proofErr w:type="spellStart"/>
+      <w:r>
+        <w:t>swagger</w:t>
+      </w:r>
+      <w:proofErr w:type="spellEnd"/>
+      <w:r>
+        <w:t xml:space="preserve"> por exemplo olha, dou atualizar e o </w:t>
+      </w:r>
+      <w:proofErr w:type="spellStart"/>
+      <w:r>
+        <w:t>swagger</w:t>
+      </w:r>
+      <w:proofErr w:type="spellEnd"/>
+      <w:r>
+        <w:t xml:space="preserve"> está de pé, isso significa que ela está rodando, ok? Você também pode ver, né, que lá está escrito, no seu terminal está escrito assim, servidor rodando na porta x, né? Por exemplo, o meu aqui está na porta 3000, está bom? Vou vir aqui, olha só, meu último resultado que eu tinha aqui era resultado de falha. Eu quero que você roda 1 vez o teste para que ele dê sucesso. Então, como você vai fazer? K 6 </w:t>
+      </w:r>
+      <w:proofErr w:type="spellStart"/>
+      <w:r>
+        <w:t>run</w:t>
+      </w:r>
+      <w:proofErr w:type="spellEnd"/>
+      <w:r>
+        <w:t xml:space="preserve">, espaço testes barra login ponto teste ponto j s, roda o teste. Sei lá, o meu está rodando aqui, está vendo olha? Já foram 4 de 10, 5 de 10, 6 de 10 e assim por diante olha. Está terminando o teste aqui, terminou. Agora se eu subir aqui você vai ver que os testes estão passando, os </w:t>
+      </w:r>
+      <w:proofErr w:type="spellStart"/>
+      <w:r>
+        <w:t>checks</w:t>
+      </w:r>
+      <w:proofErr w:type="spellEnd"/>
+      <w:r>
+        <w:t xml:space="preserve"> estão </w:t>
+      </w:r>
+      <w:r>
+        <w:lastRenderedPageBreak/>
+        <w:t xml:space="preserve">passando, né? E o que eu quero que você veja aqui? Eu quero que você veja isso olha. A gente vai criar o nosso 1º </w:t>
+      </w:r>
+      <w:proofErr w:type="spellStart"/>
+      <w:r>
+        <w:t>threshold</w:t>
+      </w:r>
+      <w:proofErr w:type="spellEnd"/>
+      <w:r>
+        <w:t xml:space="preserve"> e eu quero que você crie </w:t>
+      </w:r>
+      <w:proofErr w:type="spellStart"/>
+      <w:r>
+        <w:t>threshold</w:t>
+      </w:r>
+      <w:proofErr w:type="spellEnd"/>
+      <w:r>
+        <w:t xml:space="preserve"> pra isso aqui olha, pro HTTP </w:t>
+      </w:r>
+      <w:proofErr w:type="spellStart"/>
+      <w:r>
+        <w:t>React</w:t>
+      </w:r>
+      <w:proofErr w:type="spellEnd"/>
+      <w:r>
+        <w:t xml:space="preserve"> </w:t>
+      </w:r>
+      <w:proofErr w:type="spellStart"/>
+      <w:r>
+        <w:t>Duration</w:t>
+      </w:r>
+      <w:proofErr w:type="spellEnd"/>
+      <w:r>
+        <w:t xml:space="preserve">, </w:t>
+      </w:r>
+      <w:proofErr w:type="gramStart"/>
+      <w:r>
+        <w:t>É</w:t>
+      </w:r>
+      <w:proofErr w:type="gramEnd"/>
+      <w:r>
+        <w:t xml:space="preserve"> esse cara que a gente vai usar. Então, você pode até ver aqui olha, seleciona, botão direito copiar, é esse cara que a gente vai usar. E eu quero que você coloca de propósito aí, 1 quantidade de milissegundos que é maior, que é, desculpa, que é menor do que o que a gente está tendo de respostas aqui, só pra você ver o </w:t>
+      </w:r>
+      <w:proofErr w:type="spellStart"/>
+      <w:r>
+        <w:t>threshold</w:t>
+      </w:r>
+      <w:proofErr w:type="spellEnd"/>
+      <w:r>
+        <w:t xml:space="preserve"> quebrando, entendeu? Então olha só, aqui ele está falando que o </w:t>
+      </w:r>
+      <w:proofErr w:type="spellStart"/>
+      <w:r>
+        <w:t>average</w:t>
+      </w:r>
+      <w:proofErr w:type="spellEnd"/>
+      <w:r>
+        <w:t xml:space="preserve"> é 11.29 milissegundos, aqui ele está falando que o min de menor é 2.83. Está falando que o </w:t>
+      </w:r>
+      <w:proofErr w:type="spellStart"/>
+      <w:r>
+        <w:t>med</w:t>
+      </w:r>
+      <w:proofErr w:type="spellEnd"/>
+      <w:r>
+        <w:t xml:space="preserve">, que é a nossa mediana, é de 4 ponto meia 2 milissegundos, está vendo? O nosso </w:t>
+      </w:r>
+      <w:proofErr w:type="spellStart"/>
+      <w:r>
+        <w:t>max</w:t>
+      </w:r>
+      <w:proofErr w:type="spellEnd"/>
+      <w:r>
+        <w:t xml:space="preserve"> é 70 e O p 90 é de 12 milissegundos e o p 95 de 42. Então a gente vai criar alguma coisa para quebrar isso daqui de propósito, está bom? Só pra você </w:t>
+      </w:r>
+      <w:proofErr w:type="gramStart"/>
+      <w:r>
+        <w:t>ver ele</w:t>
+      </w:r>
+      <w:proofErr w:type="gramEnd"/>
+      <w:r>
+        <w:t xml:space="preserve"> quebrando. Como que a gente faz isso, </w:t>
+      </w:r>
+      <w:proofErr w:type="spellStart"/>
+      <w:r>
+        <w:t>Julio</w:t>
+      </w:r>
+      <w:proofErr w:type="spellEnd"/>
+      <w:r>
+        <w:t xml:space="preserve">? Vem aqui olha, no login </w:t>
+      </w:r>
+      <w:proofErr w:type="spellStart"/>
+      <w:r>
+        <w:t>tests</w:t>
+      </w:r>
+      <w:proofErr w:type="spellEnd"/>
+      <w:r>
+        <w:t xml:space="preserve"> tem aqui o </w:t>
+      </w:r>
+      <w:proofErr w:type="spellStart"/>
+      <w:r>
+        <w:t>options</w:t>
+      </w:r>
+      <w:proofErr w:type="spellEnd"/>
+      <w:r>
+        <w:t xml:space="preserve">, está vendo? </w:t>
+      </w:r>
+      <w:proofErr w:type="spellStart"/>
+      <w:r>
+        <w:t>Iterations</w:t>
+      </w:r>
+      <w:proofErr w:type="spellEnd"/>
+      <w:r>
+        <w:t xml:space="preserve">, vou vir aqui no final, vou dar </w:t>
+      </w:r>
+      <w:proofErr w:type="spellStart"/>
+      <w:r>
+        <w:t>enter</w:t>
+      </w:r>
+      <w:proofErr w:type="spellEnd"/>
+      <w:r>
+        <w:t xml:space="preserve"> e vou </w:t>
+      </w:r>
+      <w:proofErr w:type="gramStart"/>
+      <w:r>
+        <w:t>digitar,.</w:t>
+      </w:r>
+      <w:proofErr w:type="gramEnd"/>
+      <w:r>
+        <w:t xml:space="preserve"> Ok? 2 pontos, abrir chave. Aqui agora eu vou colocar a propriedade que representa a métrica que eu tenho aqui. Então vou pegar aqui o, né, se você já pegou não tem problema, estou pegando aqui de novo só para garantir. Vou vir aqui e vou colar e vou dar 2 pontos igual, colchete, e aqui dentro eu coloco aspas simples, aspas simples. É assim que a gente que a gente coloca isso. Então aqui no </w:t>
+      </w:r>
+      <w:proofErr w:type="spellStart"/>
+      <w:r>
+        <w:t>hack</w:t>
+      </w:r>
+      <w:proofErr w:type="spellEnd"/>
+      <w:r>
+        <w:t xml:space="preserve"> </w:t>
+      </w:r>
+      <w:proofErr w:type="spellStart"/>
+      <w:r>
+        <w:t>duration</w:t>
+      </w:r>
+      <w:proofErr w:type="spellEnd"/>
+      <w:r>
+        <w:t xml:space="preserve">, que que a gente vai colocar? A gente vai colocar qualquer 1 dessas, qualquer 1 dessas medidas que a gente tem aqui. O </w:t>
+      </w:r>
+      <w:proofErr w:type="spellStart"/>
+      <w:r>
+        <w:t>average</w:t>
+      </w:r>
+      <w:proofErr w:type="spellEnd"/>
+      <w:r>
+        <w:t xml:space="preserve">, que é o a v g, o min, o médio, o </w:t>
+      </w:r>
+      <w:proofErr w:type="spellStart"/>
+      <w:r>
+        <w:t>max</w:t>
+      </w:r>
+      <w:proofErr w:type="spellEnd"/>
+      <w:r>
+        <w:t xml:space="preserve">, o p 90, mas 2º aquilo que o seu time decidiu, está bom? Vamos dizer que o meu time decidiu que o p 90 deveria ser menor do que 10 milissegundos, é extremamente rápido, tá? Mas eu estou colocando só pra quebrar de propósito. Então o que eu vou fazer? Vou vir aqui e vou colocar o p 90. Então o que eu vou fazer? Vou vir aqui e vou colocar o p 90 menor do que 10. Não poderia colocar menor ou igual a 10 também, tá? Poderia colocar maior ou maior ou igual a 10, né? Eu estou colocando menor do que 10, ou seja, tem que ser 9.99 milissegundos, por exemplo. Certo? Está aqui. Ah, </w:t>
+      </w:r>
+      <w:proofErr w:type="spellStart"/>
+      <w:r>
+        <w:t>Julio</w:t>
+      </w:r>
+      <w:proofErr w:type="spellEnd"/>
+      <w:r>
+        <w:t xml:space="preserve">, mas não dá para colocar 2 medidas? Dá </w:t>
+      </w:r>
+      <w:proofErr w:type="spellStart"/>
+      <w:r>
+        <w:t>dá</w:t>
+      </w:r>
+      <w:proofErr w:type="spellEnd"/>
+      <w:r>
+        <w:t xml:space="preserve"> sim, normal, mas vamos por enquanto devagar, está bom? Esse daqui é o nosso 1º </w:t>
+      </w:r>
+      <w:proofErr w:type="spellStart"/>
+      <w:r>
+        <w:t>threshold</w:t>
+      </w:r>
+      <w:proofErr w:type="spellEnd"/>
+      <w:r>
+        <w:t xml:space="preserve">. Vou salvar, ok? E agora eu vou rodar. E o teste que estava passando agora provavelmente vai quebrar. </w:t>
+      </w:r>
+      <w:proofErr w:type="spellStart"/>
+      <w:r>
+        <w:t>Lembrese</w:t>
+      </w:r>
+      <w:proofErr w:type="spellEnd"/>
+      <w:r>
+        <w:t xml:space="preserve"> de 1 coisa, testes de performance revelam essas durações só que elas nem sempre são iguais. Então agora está 12 8 4, quando eu vou dar de novo pode ser diferente, está bom? Isso é normal. Porque a performance depende, ela não é estática, né? Ela é algo dinâmico, né? Depende muito do funcionamento do software, quanto ele está sendo utilizado e assim por diante. Vamos lá. Vou pressionar aqui a tecla pra cima, vou dar </w:t>
+      </w:r>
+      <w:proofErr w:type="spellStart"/>
+      <w:r>
+        <w:t>enter</w:t>
+      </w:r>
+      <w:proofErr w:type="spellEnd"/>
+      <w:r>
+        <w:t xml:space="preserve"> pra rodar de novo. Olha só. Ele já está, olha só, ele já está rodando aqui. Terminou de rodar, vamos ver quanto que foi o p 90 aqui. Olha só, o p 90 agora foi 4.80 e milissegundos. Então está dentro do nosso </w:t>
+      </w:r>
+      <w:proofErr w:type="spellStart"/>
+      <w:r>
+        <w:t>threshold</w:t>
+      </w:r>
+      <w:proofErr w:type="spellEnd"/>
+      <w:r>
+        <w:t xml:space="preserve">, você vai ver que agora está aparecendo aqui olha, </w:t>
+      </w:r>
+      <w:proofErr w:type="spellStart"/>
+      <w:r>
+        <w:t>threshold</w:t>
+      </w:r>
+      <w:proofErr w:type="spellEnd"/>
+      <w:r>
+        <w:t xml:space="preserve">, está vendo olha? Está falando que o p 90 tinha, que o h t p tinha o p 90 menor do que 10, né? E aqui ele foi 4 e 80 e logo passou, teve sucesso. Eu vou tornar esse negócio aqui impossível, eu vou colocar milissegundo, está vendo olha? P 90 é menor do que milissegundo. Agora eu duvido esse negócio passar. Vamos </w:t>
+      </w:r>
+      <w:proofErr w:type="spellStart"/>
+      <w:r>
+        <w:t>vamos</w:t>
+      </w:r>
+      <w:proofErr w:type="spellEnd"/>
+      <w:r>
+        <w:t xml:space="preserve"> quebrar esse teste. </w:t>
+      </w:r>
+      <w:proofErr w:type="spellStart"/>
+      <w:r>
+        <w:t>Enter</w:t>
+      </w:r>
+      <w:proofErr w:type="spellEnd"/>
+      <w:r>
+        <w:t xml:space="preserve">. Está rodei, está bom? O teste está. Está rodando aqui. Estou vendo aqui que está rodando. E olha só agora, terminou em erro. Vamos ver o que aconteceu? Olha só. </w:t>
+      </w:r>
+      <w:proofErr w:type="spellStart"/>
+      <w:r>
+        <w:t>Threshold</w:t>
+      </w:r>
+      <w:proofErr w:type="spellEnd"/>
+      <w:r>
+        <w:t xml:space="preserve"> zone </w:t>
+      </w:r>
+      <w:proofErr w:type="spellStart"/>
+      <w:r>
+        <w:t>metrics</w:t>
+      </w:r>
+      <w:proofErr w:type="spellEnd"/>
+      <w:r>
+        <w:t xml:space="preserve">, HTTP </w:t>
+      </w:r>
+      <w:proofErr w:type="spellStart"/>
+      <w:r>
+        <w:t>hack</w:t>
+      </w:r>
+      <w:proofErr w:type="spellEnd"/>
+      <w:r>
+        <w:t xml:space="preserve"> </w:t>
+      </w:r>
+      <w:proofErr w:type="spellStart"/>
+      <w:r>
+        <w:t>duration</w:t>
+      </w:r>
+      <w:proofErr w:type="spellEnd"/>
+      <w:r>
+        <w:t xml:space="preserve"> </w:t>
+      </w:r>
+      <w:proofErr w:type="spellStart"/>
+      <w:r>
+        <w:t>have</w:t>
+      </w:r>
+      <w:proofErr w:type="spellEnd"/>
+      <w:r>
+        <w:t xml:space="preserve"> </w:t>
+      </w:r>
+      <w:proofErr w:type="spellStart"/>
+      <w:r>
+        <w:t>been</w:t>
+      </w:r>
+      <w:proofErr w:type="spellEnd"/>
+      <w:r>
+        <w:t xml:space="preserve"> </w:t>
+      </w:r>
+      <w:proofErr w:type="spellStart"/>
+      <w:r>
+        <w:t>crossed</w:t>
+      </w:r>
+      <w:proofErr w:type="spellEnd"/>
+      <w:r>
+        <w:t xml:space="preserve">, ou seja, aquele </w:t>
+      </w:r>
+      <w:proofErr w:type="spellStart"/>
+      <w:r>
+        <w:t>threshold</w:t>
+      </w:r>
+      <w:proofErr w:type="spellEnd"/>
+      <w:r>
+        <w:t xml:space="preserve"> nessa medida de HTTP </w:t>
+      </w:r>
+      <w:proofErr w:type="spellStart"/>
+      <w:r>
+        <w:t>hack</w:t>
+      </w:r>
+      <w:proofErr w:type="spellEnd"/>
+      <w:r>
+        <w:t xml:space="preserve"> </w:t>
+      </w:r>
+      <w:proofErr w:type="spellStart"/>
+      <w:r>
+        <w:t>duration</w:t>
+      </w:r>
+      <w:proofErr w:type="spellEnd"/>
+      <w:r>
+        <w:t xml:space="preserve"> foi cruzado. Isso significa que ele ultra que o valor foi ultrapassado. Vamos ver, estou arrastando pra cima aqui. Olha os </w:t>
+      </w:r>
+      <w:proofErr w:type="spellStart"/>
+      <w:r>
+        <w:t>checks</w:t>
+      </w:r>
+      <w:proofErr w:type="spellEnd"/>
+      <w:r>
+        <w:t xml:space="preserve"> funcionando normalmente, porque não tem nada a ver com o </w:t>
+      </w:r>
+      <w:proofErr w:type="spellStart"/>
+      <w:r>
+        <w:t>check</w:t>
+      </w:r>
+      <w:proofErr w:type="spellEnd"/>
+      <w:r>
+        <w:t xml:space="preserve"> né, tem a ver com os </w:t>
+      </w:r>
+      <w:proofErr w:type="spellStart"/>
+      <w:r>
+        <w:t>thresholds</w:t>
+      </w:r>
+      <w:proofErr w:type="spellEnd"/>
+      <w:r>
+        <w:t xml:space="preserve">. Está falando aqui que o p 90 deveria ser menor do </w:t>
+      </w:r>
+      <w:proofErr w:type="gramStart"/>
+      <w:r>
+        <w:t>que</w:t>
+      </w:r>
+      <w:proofErr w:type="gramEnd"/>
+      <w:r>
+        <w:t xml:space="preserve"> mas o p 90 era igual a 6. Logo falhou esse </w:t>
+      </w:r>
+      <w:proofErr w:type="spellStart"/>
+      <w:r>
+        <w:t>threshold</w:t>
+      </w:r>
+      <w:proofErr w:type="spellEnd"/>
+      <w:r>
+        <w:t xml:space="preserve">, então </w:t>
+      </w:r>
+      <w:proofErr w:type="spellStart"/>
+      <w:r>
+        <w:t>threshold</w:t>
+      </w:r>
+      <w:proofErr w:type="spellEnd"/>
+      <w:r>
+        <w:t xml:space="preserve"> falha seus testes. Agora, quando a gente fala sobre </w:t>
+      </w:r>
+      <w:proofErr w:type="spellStart"/>
+      <w:r>
+        <w:t>check</w:t>
+      </w:r>
+      <w:proofErr w:type="spellEnd"/>
+      <w:r>
+        <w:t xml:space="preserve">, isso não falha seus testes. Está bom? Não, só de bater aí isso daqui, já falhou pra gente, você já sabe aqui que deu errado. Certo? Vamos lá então. Vou vir aqui agora, eu quero, quero fazer 1 1 mudança aqui. Por exemplo, eu quero que seja o p 90 menor do que 10, ok? E eu quero também que, ainda assim, dentro desse </w:t>
+      </w:r>
+      <w:proofErr w:type="spellStart"/>
+      <w:r>
+        <w:t>threshold</w:t>
+      </w:r>
+      <w:proofErr w:type="spellEnd"/>
+      <w:r>
+        <w:t xml:space="preserve"> de HTTP, o </w:t>
+      </w:r>
+      <w:proofErr w:type="spellStart"/>
+      <w:r>
+        <w:t>max</w:t>
+      </w:r>
+      <w:proofErr w:type="spellEnd"/>
+      <w:r>
+        <w:t xml:space="preserve"> aqui, </w:t>
+      </w:r>
+      <w:proofErr w:type="spellStart"/>
+      <w:r>
+        <w:t>max</w:t>
+      </w:r>
+      <w:proofErr w:type="spellEnd"/>
+      <w:r>
+        <w:t xml:space="preserve"> que é o máximo, né? Máximo de </w:t>
+      </w:r>
+      <w:proofErr w:type="spellStart"/>
+      <w:r>
+        <w:t>de</w:t>
+      </w:r>
+      <w:proofErr w:type="spellEnd"/>
+      <w:r>
+        <w:t xml:space="preserve"> </w:t>
+      </w:r>
+      <w:proofErr w:type="spellStart"/>
+      <w:r>
+        <w:t>de</w:t>
+      </w:r>
+      <w:proofErr w:type="spellEnd"/>
+      <w:r>
+        <w:t xml:space="preserve"> variável de tempo de </w:t>
+      </w:r>
+      <w:r>
+        <w:lastRenderedPageBreak/>
+        <w:t xml:space="preserve">resposta, ela também </w:t>
+      </w:r>
+      <w:proofErr w:type="gramStart"/>
+      <w:r>
+        <w:t>seja Então</w:t>
+      </w:r>
+      <w:proofErr w:type="gramEnd"/>
+      <w:r>
+        <w:t xml:space="preserve"> o eu faço? Eu faço o </w:t>
+      </w:r>
+      <w:proofErr w:type="spellStart"/>
+      <w:r>
+        <w:t>max</w:t>
+      </w:r>
+      <w:proofErr w:type="spellEnd"/>
+      <w:r>
+        <w:t xml:space="preserve">, tem que sempre ser menor do que por exemplo. Estou forçando isso aqui só para o </w:t>
+      </w:r>
+      <w:proofErr w:type="spellStart"/>
+      <w:r>
+        <w:t>max</w:t>
+      </w:r>
+      <w:proofErr w:type="spellEnd"/>
+      <w:r>
+        <w:t xml:space="preserve"> falhar, está bom? Está aí. Tenho 2, né, 2 2 para essa para essa métrica aqui. Vou rodar aqui o teste. Está rodando aí pra gente. Terminou com erro, está vendo olha? Tem alguns na métrica de h t p </w:t>
+      </w:r>
+      <w:proofErr w:type="spellStart"/>
+      <w:r>
+        <w:t>hack</w:t>
+      </w:r>
+      <w:proofErr w:type="spellEnd"/>
+      <w:r>
+        <w:t xml:space="preserve"> </w:t>
+      </w:r>
+      <w:proofErr w:type="spellStart"/>
+      <w:r>
+        <w:t>duration</w:t>
+      </w:r>
+      <w:proofErr w:type="spellEnd"/>
+      <w:r>
+        <w:t xml:space="preserve"> que foram cruzados. Vou subir lá pra ver e está aqui olha. O </w:t>
+      </w:r>
+      <w:proofErr w:type="spellStart"/>
+      <w:r>
+        <w:t>hack</w:t>
+      </w:r>
+      <w:proofErr w:type="spellEnd"/>
+      <w:r>
+        <w:t xml:space="preserve"> </w:t>
+      </w:r>
+      <w:proofErr w:type="spellStart"/>
+      <w:r>
+        <w:t>duration</w:t>
+      </w:r>
+      <w:proofErr w:type="spellEnd"/>
+      <w:r>
+        <w:t xml:space="preserve"> tem esse e esse, e o 2º foi o que falhou. Beleza. </w:t>
+      </w:r>
+      <w:proofErr w:type="spellStart"/>
+      <w:r>
+        <w:t>Julio</w:t>
+      </w:r>
+      <w:proofErr w:type="spellEnd"/>
+      <w:r>
+        <w:t xml:space="preserve">, e se eu quiser colocar 1 outra, 1 outra métrica aqui por exemplo, pra, vamos ver. Aqui, pra h </w:t>
+      </w:r>
+      <w:proofErr w:type="gramStart"/>
+      <w:r>
+        <w:t>t</w:t>
+      </w:r>
+      <w:proofErr w:type="gramEnd"/>
+      <w:r>
+        <w:t xml:space="preserve"> </w:t>
+      </w:r>
+      <w:proofErr w:type="spellStart"/>
+      <w:r>
+        <w:t>t</w:t>
+      </w:r>
+      <w:proofErr w:type="spellEnd"/>
+      <w:r>
+        <w:t xml:space="preserve"> p. Eu consigo? Consegue. Vou vir aqui olha, venho aqui no final do, coloco 1 vírgula, </w:t>
+      </w:r>
+      <w:proofErr w:type="spellStart"/>
+      <w:r>
+        <w:t>enter</w:t>
+      </w:r>
+      <w:proofErr w:type="spellEnd"/>
+      <w:r>
+        <w:t xml:space="preserve">, coloco aqui essa, 2 pontos colchete, e aqui dentro a gente vai colocar alguma coisa. Que que é? Aqui olha, a gente vai colocar esse Então o ele é por percentual. O que que a gente vai fazer? Aqui dentro eu vou colocar assim </w:t>
+      </w:r>
+      <w:proofErr w:type="gramStart"/>
+      <w:r>
+        <w:t>olha,,</w:t>
+      </w:r>
+      <w:proofErr w:type="gramEnd"/>
+      <w:r>
+        <w:t xml:space="preserve"> está vendo? Vamos dizer aqui que o ele tem que ser igual a 0. Então coloca aqui igual a, vamos colocar igual, igual não, né? Maior ou menor do que 0.0 Isso aqui significa que a quantidade de falhas tem que ser menor do que por 100. Se tiver 1 falha </w:t>
+      </w:r>
+      <w:proofErr w:type="gramStart"/>
+      <w:r>
+        <w:t>já</w:t>
+      </w:r>
+      <w:proofErr w:type="gramEnd"/>
+      <w:r>
+        <w:t xml:space="preserve"> </w:t>
+      </w:r>
+      <w:proofErr w:type="spellStart"/>
+      <w:r>
+        <w:t>já</w:t>
+      </w:r>
+      <w:proofErr w:type="spellEnd"/>
+      <w:r>
+        <w:t xml:space="preserve"> deu problema, certo? E aí eu vou rodar aqui 1 vez. Esse daqui ele vai, esse aqui ele vai sair como sucesso. Por quê? Porque a gente não está enfrentando nenhum erro nessa p I, ok? Mas estou rodando essa daqui, </w:t>
+      </w:r>
+      <w:proofErr w:type="gramStart"/>
+      <w:r>
+        <w:t>já</w:t>
+      </w:r>
+      <w:proofErr w:type="gramEnd"/>
+      <w:r>
+        <w:t xml:space="preserve"> </w:t>
+      </w:r>
+      <w:proofErr w:type="spellStart"/>
+      <w:r>
+        <w:t>já</w:t>
+      </w:r>
+      <w:proofErr w:type="spellEnd"/>
+      <w:r>
+        <w:t xml:space="preserve"> a gente roda de novo pra você, e daí a gente matar a p I pra você ver que daí ela vai registrar erro, está bom? Mas olha só, vem aqui pra cima olha, o h t p </w:t>
+      </w:r>
+      <w:proofErr w:type="spellStart"/>
+      <w:r>
+        <w:t>hack</w:t>
+      </w:r>
+      <w:proofErr w:type="spellEnd"/>
+      <w:r>
+        <w:t xml:space="preserve"> </w:t>
+      </w:r>
+      <w:proofErr w:type="spellStart"/>
+      <w:r>
+        <w:t>duration</w:t>
+      </w:r>
+      <w:proofErr w:type="spellEnd"/>
+      <w:r>
+        <w:t xml:space="preserve"> passou o 1º, o 2º falhou porque era só de 2º, e o 3º que é o, está falando aqui que o era 0 por 100, logo ele passou. Agora a gente vai fazer a mudança aqui, está bom? Enquanto eu estiver rodando esse teste eu vou matar a p I. Você lembra como matar a p I, né? Ctrl c. Vou clicar aqui pra rodar, está rodando, vou vir aqui no meu outro computador, vou dar </w:t>
+      </w:r>
+      <w:proofErr w:type="spellStart"/>
+      <w:r>
+        <w:t>control</w:t>
+      </w:r>
+      <w:proofErr w:type="spellEnd"/>
+      <w:r>
+        <w:t xml:space="preserve"> c, pronto. Aqui já serviu olha, pra ele notar que a API caiu, os </w:t>
+      </w:r>
+      <w:proofErr w:type="spellStart"/>
+      <w:r>
+        <w:t>checks</w:t>
+      </w:r>
+      <w:proofErr w:type="spellEnd"/>
+      <w:r>
+        <w:t xml:space="preserve"> já estão falhando e eu venho aqui olha, olha só, h </w:t>
+      </w:r>
+      <w:proofErr w:type="gramStart"/>
+      <w:r>
+        <w:t>t</w:t>
+      </w:r>
+      <w:proofErr w:type="gramEnd"/>
+      <w:r>
+        <w:t xml:space="preserve"> </w:t>
+      </w:r>
+      <w:proofErr w:type="spellStart"/>
+      <w:r>
+        <w:t>t</w:t>
+      </w:r>
+      <w:proofErr w:type="spellEnd"/>
+      <w:r>
+        <w:t xml:space="preserve"> p </w:t>
+      </w:r>
+      <w:proofErr w:type="spellStart"/>
+      <w:r>
+        <w:t>hack</w:t>
+      </w:r>
+      <w:proofErr w:type="spellEnd"/>
+      <w:r>
+        <w:t xml:space="preserve"> </w:t>
+      </w:r>
+      <w:proofErr w:type="spellStart"/>
+      <w:r>
+        <w:t>failed</w:t>
+      </w:r>
+      <w:proofErr w:type="spellEnd"/>
+      <w:r>
+        <w:t xml:space="preserve">. Aqui a gente estava esperando que o fosse de 0.0 ou seja, por 100, mas ele já falhou 70 por 100, logo já não está obedecendo esse meu </w:t>
+      </w:r>
+      <w:proofErr w:type="spellStart"/>
+      <w:r>
+        <w:t>threshold</w:t>
+      </w:r>
+      <w:proofErr w:type="spellEnd"/>
+      <w:r>
+        <w:t xml:space="preserve"> e por isso o teste falhou. Ok? Então esses daqui são os </w:t>
+      </w:r>
+      <w:proofErr w:type="spellStart"/>
+      <w:r>
+        <w:t>thresholds</w:t>
+      </w:r>
+      <w:proofErr w:type="spellEnd"/>
+      <w:r>
+        <w:t>. É você configurar aquelas variáveis pra que você consiga então dizer se o seu teste está passando ainda ou não. É recurso legal pra você usar, e o recurso que eu mais uso aqui são os percentis, beleza? Que se vê na próxima aula.</w:t>
+      </w:r>
+    </w:p>
+    <w:p>
+      <w:pPr>
+        <w:spacing w:after="0"/>
+      </w:pPr>
+      <w:r>
+        <w:pict w14:anchorId="5ABC5FA5">
+          <v:rect id="_x0000_i1038" style="width:0;height:1.5pt" o:hralign="center" o:bullet="t" o:hrstd="t" o:hr="t" fillcolor="#a0a0a0" stroked="f"/>
+        </w:pict>
+      </w:r>
+    </w:p>
+    <w:p>
+      <w:pPr>
+        <w:rPr>
+          <w:b/>
+          <w:bCs/>
+        </w:rPr>
+      </w:pPr>
+      <w:r>
+        <w:rPr>
+          <w:b/>
+          <w:bCs/>
+        </w:rPr>
         <w:t xml:space="preserve">10. </w:t>
       </w:r>
       <w:r>
-        <w:tab/>
+        <w:rPr>
+          <w:b/>
+          <w:bCs/>
+        </w:rPr>
+        <w:t>GERANDO RELATÓRIOS DE EXECUÇÃO</w:t>
+      </w:r>
+    </w:p>
+    <w:p>
+      <w:pPr>
+        <w:spacing w:after="0"/>
+      </w:pPr>
+      <w:r>
+        <w:t xml:space="preserve">Vão aprender agora como gerar relatórios web com o k 6. Esses relatórios são mais gráficos e ajudam você a ter 1 noção pouco melhor de quais foram os resultados obtidos durante a execução dos testes. Pra isso, a gente vai aqui na documentação do k 6, vai clicar em </w:t>
+      </w:r>
+      <w:proofErr w:type="spellStart"/>
+      <w:r>
+        <w:t>results</w:t>
+      </w:r>
+      <w:proofErr w:type="spellEnd"/>
+      <w:r>
+        <w:t xml:space="preserve"> output, e vai clicar aqui olha, em web dashboard. Está vendo? Esse daqui é </w:t>
+      </w:r>
+      <w:proofErr w:type="gramStart"/>
+      <w:r>
+        <w:t>o web</w:t>
+      </w:r>
+      <w:proofErr w:type="gramEnd"/>
+      <w:r>
+        <w:t xml:space="preserve"> dashboard. Ele traz pra gente alguns gráficos que vão ajudar você a ter 1 noção muito melhor de como foi a execução dos seus testes. Bem, pra gente criar esse relatório, não é nada complexo, está bom? O que você vai fazer é o seguinte olha, aqui ele tem algumas formas de você utilizar, então você vem aqui olha, coloca essa variável aqui de ambiente, k </w:t>
+      </w:r>
+      <w:proofErr w:type="gramStart"/>
+      <w:r>
+        <w:t>6 web</w:t>
+      </w:r>
+      <w:proofErr w:type="gramEnd"/>
+      <w:r>
+        <w:t xml:space="preserve"> dashboard, recebendo </w:t>
+      </w:r>
+      <w:proofErr w:type="spellStart"/>
+      <w:r>
+        <w:t>true</w:t>
+      </w:r>
+      <w:proofErr w:type="spellEnd"/>
+      <w:r>
+        <w:t xml:space="preserve"> antes da execução do comando em si do k 6, está bom? Essa </w:t>
+      </w:r>
+      <w:proofErr w:type="spellStart"/>
+      <w:r>
+        <w:t>essa</w:t>
+      </w:r>
+      <w:proofErr w:type="spellEnd"/>
+      <w:r>
+        <w:t xml:space="preserve"> daqui é forma com que a gente faz pra criar. Só quando a gente cria desse jeito aqui, olha só o que vai acontecer, ele vai gerar aqui pra gente esse </w:t>
+      </w:r>
+      <w:proofErr w:type="spellStart"/>
+      <w:r>
+        <w:t>esse</w:t>
+      </w:r>
+      <w:proofErr w:type="spellEnd"/>
+      <w:r>
+        <w:t xml:space="preserve"> endereço onde você vai poder encontrar o relatório criado. Agora, 1 outra forma de você fazer é você gerar arquivo HTML com essas informações, está vendo? Então como você faz? Você, em vez de você só colocar o k </w:t>
+      </w:r>
+      <w:proofErr w:type="gramStart"/>
+      <w:r>
+        <w:t>6 web</w:t>
+      </w:r>
+      <w:proofErr w:type="gramEnd"/>
+      <w:r>
+        <w:t xml:space="preserve"> dashboard </w:t>
+      </w:r>
+      <w:proofErr w:type="spellStart"/>
+      <w:r>
+        <w:t>true</w:t>
+      </w:r>
+      <w:proofErr w:type="spellEnd"/>
+      <w:r>
+        <w:t xml:space="preserve">, você coloca aqui olha, k </w:t>
+      </w:r>
+      <w:proofErr w:type="gramStart"/>
+      <w:r>
+        <w:t>6 web</w:t>
+      </w:r>
+      <w:proofErr w:type="gramEnd"/>
+      <w:r>
+        <w:t xml:space="preserve"> dashboard </w:t>
+      </w:r>
+      <w:proofErr w:type="spellStart"/>
+      <w:r>
+        <w:t>export</w:t>
+      </w:r>
+      <w:proofErr w:type="spellEnd"/>
+      <w:r>
+        <w:t xml:space="preserve">, e aí você coloca aqui </w:t>
+      </w:r>
+      <w:proofErr w:type="gramStart"/>
+      <w:r>
+        <w:t>a, o</w:t>
+      </w:r>
+      <w:proofErr w:type="gramEnd"/>
+      <w:r>
+        <w:t xml:space="preserve"> qual é o nome do arquivo onde você vai exportar esse relatório, está bom? A gente vai fazer das 2 formas pra você ver a diferença. Vamos 1º pra isso daqui olha. A gente </w:t>
+      </w:r>
+      <w:proofErr w:type="spellStart"/>
+      <w:r>
+        <w:t>copia</w:t>
+      </w:r>
+      <w:proofErr w:type="spellEnd"/>
+      <w:r>
+        <w:t xml:space="preserve"> só essa variável aqui, ok? Então, vou copiar daqui. Vou ir lá, no meu v s </w:t>
+      </w:r>
+      <w:proofErr w:type="spellStart"/>
+      <w:r>
+        <w:t>code</w:t>
+      </w:r>
+      <w:proofErr w:type="spellEnd"/>
+      <w:r>
+        <w:t xml:space="preserve">. Ah, coisa importante, né? No fim da nossa aula passada a gente desligou API, então se você ainda não voltou a sua, retorne, está bom? Então pra rodar a sua p I, você vai ir lá numa outra janela qualquer, eu estou rodando numa outra janela aqui, onde eu vou rodar o comando NPM </w:t>
+      </w:r>
+      <w:proofErr w:type="spellStart"/>
+      <w:r>
+        <w:t>run</w:t>
+      </w:r>
+      <w:proofErr w:type="spellEnd"/>
+      <w:r>
+        <w:t xml:space="preserve"> </w:t>
+      </w:r>
+      <w:proofErr w:type="spellStart"/>
+      <w:r>
+        <w:t>rest</w:t>
+      </w:r>
+      <w:proofErr w:type="spellEnd"/>
+      <w:r>
+        <w:t xml:space="preserve"> traço API. Da mesma forma como se eu rodava antes. Se eu vir aqui agora olha, pressiono pra cima, </w:t>
+      </w:r>
+      <w:proofErr w:type="spellStart"/>
+      <w:r>
+        <w:t>enter</w:t>
+      </w:r>
+      <w:proofErr w:type="spellEnd"/>
+      <w:r>
+        <w:t xml:space="preserve">, com API ligada e agora ele está </w:t>
+      </w:r>
+      <w:r>
+        <w:lastRenderedPageBreak/>
+        <w:t xml:space="preserve">rodando os testes, tá? No final ele vai mostrar aqui pra gente que os testes já foram executados, está vendo? Ele está dando esse erro, mas é porque a gente </w:t>
+      </w:r>
+      <w:proofErr w:type="spellStart"/>
+      <w:r>
+        <w:t>setou</w:t>
+      </w:r>
+      <w:proofErr w:type="spellEnd"/>
+      <w:r>
+        <w:t xml:space="preserve"> </w:t>
+      </w:r>
+      <w:proofErr w:type="gramStart"/>
+      <w:r>
+        <w:t>aquele aqueles</w:t>
+      </w:r>
+      <w:proofErr w:type="gramEnd"/>
+      <w:r>
+        <w:t xml:space="preserve"> 2 </w:t>
+      </w:r>
+      <w:proofErr w:type="spellStart"/>
+      <w:r>
+        <w:t>thresholds</w:t>
+      </w:r>
+      <w:proofErr w:type="spellEnd"/>
+      <w:r>
+        <w:t xml:space="preserve"> que são impossíveis de serem alcançados, né? Vamos já mudar esses </w:t>
+      </w:r>
+      <w:proofErr w:type="spellStart"/>
+      <w:r>
+        <w:t>thresholds</w:t>
+      </w:r>
+      <w:proofErr w:type="spellEnd"/>
+      <w:r>
+        <w:t xml:space="preserve">? Ah, não, vamos deixar assim pra </w:t>
+      </w:r>
+      <w:proofErr w:type="spellStart"/>
+      <w:r>
+        <w:t>pra</w:t>
+      </w:r>
+      <w:proofErr w:type="spellEnd"/>
+      <w:r>
+        <w:t xml:space="preserve"> que você consiga ver também, né, outras informações relacionadas ao relatório. Vamos deixar assim mesmo. Está bom. Vou ver. Vou vir aqui então, olha. Vou pressionar o pra cima. E aí aparece esse comando aqui, olha. K 6 </w:t>
+      </w:r>
+      <w:proofErr w:type="spellStart"/>
+      <w:r>
+        <w:t>run</w:t>
+      </w:r>
+      <w:proofErr w:type="spellEnd"/>
+      <w:r>
+        <w:t xml:space="preserve"> </w:t>
+      </w:r>
+      <w:proofErr w:type="spellStart"/>
+      <w:r>
+        <w:t>tests</w:t>
+      </w:r>
+      <w:proofErr w:type="spellEnd"/>
+      <w:r>
+        <w:t xml:space="preserve">, está vendo? Antes do k 6 é onde você tem que colar sua variável. Então, vou apertando pro lado esquerdo. Vou aqui com o meu teclado, chego aqui e dou </w:t>
+      </w:r>
+      <w:proofErr w:type="spellStart"/>
+      <w:r>
+        <w:t>control</w:t>
+      </w:r>
+      <w:proofErr w:type="spellEnd"/>
+      <w:r>
+        <w:t xml:space="preserve"> v. Estão vendo? Agora está assim olha, k </w:t>
+      </w:r>
+      <w:proofErr w:type="gramStart"/>
+      <w:r>
+        <w:t>6 web</w:t>
+      </w:r>
+      <w:proofErr w:type="gramEnd"/>
+      <w:r>
+        <w:t xml:space="preserve"> dashboard igual a </w:t>
+      </w:r>
+      <w:proofErr w:type="spellStart"/>
+      <w:r>
+        <w:t>true</w:t>
+      </w:r>
+      <w:proofErr w:type="spellEnd"/>
+      <w:r>
+        <w:t xml:space="preserve">, espaço e aí tem todo o comando que você já executava. É desse jeito. Fez isso? Dá </w:t>
+      </w:r>
+      <w:proofErr w:type="spellStart"/>
+      <w:r>
+        <w:t>enter</w:t>
+      </w:r>
+      <w:proofErr w:type="spellEnd"/>
+      <w:r>
+        <w:t xml:space="preserve">, ele vai rodar os seus testes. Olha só, </w:t>
+      </w:r>
+      <w:proofErr w:type="gramStart"/>
+      <w:r>
+        <w:t>o web</w:t>
+      </w:r>
+      <w:proofErr w:type="gramEnd"/>
+      <w:r>
+        <w:t xml:space="preserve"> dashboard já está aqui olha, eu copio esse essa URL aqui, vou lá no meu navegador. E colo. Só que o que acontece? Esse relatório ele é relatório que ele, só o que acontece, esse relatório ele é relatório que ele funciona em tempo real. Então pra que você possa ver o relatório aqui, tem que estar no meio da execução do teste. Então o que a gente vai fazer? Vou voltar aqui no VS </w:t>
+      </w:r>
+      <w:proofErr w:type="spellStart"/>
+      <w:r>
+        <w:t>Code</w:t>
+      </w:r>
+      <w:proofErr w:type="spellEnd"/>
+      <w:r>
+        <w:t xml:space="preserve">, vou mandar rodar o teste. Vamos fazer diferente? Vai ficar bem mais factível pra você? Aqui no </w:t>
+      </w:r>
+      <w:proofErr w:type="spellStart"/>
+      <w:r>
+        <w:t>no</w:t>
+      </w:r>
+      <w:proofErr w:type="spellEnd"/>
+      <w:r>
+        <w:t xml:space="preserve"> coloca 50, por exemplo, daí seu teste vai demorar pouco mais, está vendo? Vou vir aqui, vou colocar aqui o 0 comando, vou dar </w:t>
+      </w:r>
+      <w:proofErr w:type="spellStart"/>
+      <w:r>
+        <w:t>enter</w:t>
+      </w:r>
+      <w:proofErr w:type="spellEnd"/>
+      <w:r>
+        <w:t>, volto lá pro meu navegador, atualizo aqui essa tela. Olha só. Agora sim, ele está aqui mostrando pra gente que está rodando, está vendo? Então aqui ele tem algumas informações sobre a execução. Ok? E aqui</w:t>
       </w:r>
     </w:p>
     <w:p>
@@ -3995,7 +5154,10 @@
     </w:p>
     <w:p>
       <w:pPr>
-        <w:spacing w:after="0"/>
+        <w:rPr>
+          <w:b/>
+          <w:bCs/>
+        </w:rPr>
       </w:pPr>
       <w:r>
         <w:rPr>
@@ -4004,7 +5166,282 @@
         </w:rPr>
         <w:t xml:space="preserve">11. </w:t>
       </w:r>
-      <w:r>
+      <w:proofErr w:type="spellStart"/>
+      <w:r>
+        <w:rPr>
+          <w:b/>
+          <w:bCs/>
+        </w:rPr>
+        <w:t>Versionando</w:t>
+      </w:r>
+      <w:proofErr w:type="spellEnd"/>
+      <w:r>
+        <w:rPr>
+          <w:b/>
+          <w:bCs/>
+        </w:rPr>
+        <w:t xml:space="preserve"> nosso script de teste de performance</w:t>
+      </w:r>
+    </w:p>
+    <w:p>
+      <w:r>
+        <w:t xml:space="preserve">Essa é 1 boa hora pra gente </w:t>
+      </w:r>
+      <w:proofErr w:type="spellStart"/>
+      <w:r>
+        <w:t>versionar</w:t>
+      </w:r>
+      <w:proofErr w:type="spellEnd"/>
+      <w:r>
+        <w:t xml:space="preserve"> o nosso código, né? Afinal, a gente já está trabalhando nesse script faz bastante tempo. E a partir de agora, a gente vai começar a fazer algumas mudanças em coisas que já foram escritas. Por isso, vamos começar a </w:t>
+      </w:r>
+      <w:proofErr w:type="spellStart"/>
+      <w:r>
+        <w:t>versionar</w:t>
+      </w:r>
+      <w:proofErr w:type="spellEnd"/>
+      <w:r>
+        <w:t xml:space="preserve">, assim você vai ter acesso a todas as versões que aconteceram nesse arquivo a partir de agora, beleza? Vamos lá então. O que eu vou fazer aqui é o seguinte, eu vou fazer aqui </w:t>
+      </w:r>
+      <w:proofErr w:type="spellStart"/>
+      <w:r>
+        <w:t>git</w:t>
+      </w:r>
+      <w:proofErr w:type="spellEnd"/>
+      <w:r>
+        <w:t xml:space="preserve"> status, e você vai ver que eu tenho aqui esse arquivo do HTML </w:t>
+      </w:r>
+      <w:proofErr w:type="spellStart"/>
+      <w:r>
+        <w:t>report</w:t>
+      </w:r>
+      <w:proofErr w:type="spellEnd"/>
+      <w:r>
+        <w:t xml:space="preserve"> e tenho essa pasta, que é a pasta </w:t>
+      </w:r>
+      <w:proofErr w:type="spellStart"/>
+      <w:r>
+        <w:t>tests</w:t>
+      </w:r>
+      <w:proofErr w:type="spellEnd"/>
+      <w:r>
+        <w:t xml:space="preserve">, essas 2 aqui são coisas que foram alteradas. O arquivo HTML </w:t>
+      </w:r>
+      <w:proofErr w:type="spellStart"/>
+      <w:r>
+        <w:t>report</w:t>
+      </w:r>
+      <w:proofErr w:type="spellEnd"/>
+      <w:r>
+        <w:t xml:space="preserve"> eu nunca vou </w:t>
+      </w:r>
+      <w:proofErr w:type="spellStart"/>
+      <w:r>
+        <w:t>versionar</w:t>
+      </w:r>
+      <w:proofErr w:type="spellEnd"/>
+      <w:r>
+        <w:t xml:space="preserve"> ele, por quê? Porque ele é arquivo temporário, a cada vez que eu executar ele vai ter algo diferente. Por isso, o que eu vou fazer? Vou vir aqui olha, vou criar novo arquivo, new file, ok? Que eu vou chamar de ponto </w:t>
+      </w:r>
+      <w:proofErr w:type="spellStart"/>
+      <w:r>
+        <w:t>git</w:t>
+      </w:r>
+      <w:proofErr w:type="spellEnd"/>
+      <w:r>
+        <w:t xml:space="preserve"> ignore, e aqui dentro eu já vou colocar 0HTML traço </w:t>
+      </w:r>
+      <w:proofErr w:type="spellStart"/>
+      <w:r>
+        <w:t>report</w:t>
+      </w:r>
+      <w:proofErr w:type="spellEnd"/>
+      <w:r>
+        <w:t xml:space="preserve"> ponto HTML, como sendo algo que eu quero ignorar. A partir do momento que eu faço isso, e que eu venho aqui e faço </w:t>
+      </w:r>
+      <w:proofErr w:type="spellStart"/>
+      <w:r>
+        <w:t>git</w:t>
+      </w:r>
+      <w:proofErr w:type="spellEnd"/>
+      <w:r>
+        <w:t xml:space="preserve"> status, olha só, ele já desapareceu daqui. Por que que eu faço isso? Porque eu não quero nada aqui atrapalhando a os meus arquivos que vão estar aparecendo aqui no meu </w:t>
+      </w:r>
+      <w:proofErr w:type="spellStart"/>
+      <w:r>
+        <w:t>git</w:t>
+      </w:r>
+      <w:proofErr w:type="spellEnd"/>
+      <w:r>
+        <w:t xml:space="preserve"> status, ok? Quero apenas coisas que eu realmente possa </w:t>
+      </w:r>
+      <w:proofErr w:type="spellStart"/>
+      <w:r>
+        <w:t>versionar</w:t>
+      </w:r>
+      <w:proofErr w:type="spellEnd"/>
+      <w:r>
+        <w:t xml:space="preserve">. Ótimo. Próximo passo, vou vir aqui e vou fazer </w:t>
+      </w:r>
+      <w:proofErr w:type="spellStart"/>
+      <w:r>
+        <w:t>git</w:t>
+      </w:r>
+      <w:proofErr w:type="spellEnd"/>
+      <w:r>
+        <w:t xml:space="preserve"> </w:t>
+      </w:r>
+      <w:proofErr w:type="spellStart"/>
+      <w:r>
+        <w:t>add</w:t>
+      </w:r>
+      <w:proofErr w:type="spellEnd"/>
+      <w:r>
+        <w:t xml:space="preserve"> ponto, que eu quero adicionar tanto os arquivos que estão em teste quanto esse </w:t>
+      </w:r>
+      <w:proofErr w:type="spellStart"/>
+      <w:r>
+        <w:t>git</w:t>
+      </w:r>
+      <w:proofErr w:type="spellEnd"/>
+      <w:r>
+        <w:t xml:space="preserve"> ignore. Próximo passo, vou fazer </w:t>
+      </w:r>
+      <w:proofErr w:type="spellStart"/>
+      <w:r>
+        <w:t>git</w:t>
+      </w:r>
+      <w:proofErr w:type="spellEnd"/>
+      <w:r>
+        <w:t xml:space="preserve"> status pra saber se realmente eles foram adicionados ao </w:t>
+      </w:r>
+      <w:proofErr w:type="spellStart"/>
+      <w:r>
+        <w:t>stage</w:t>
+      </w:r>
+      <w:proofErr w:type="spellEnd"/>
+      <w:r>
+        <w:t xml:space="preserve">, como deveriam, você vai ver que ele apareceu até com verdinho como sim. E o meu próximo passo agora é fazer </w:t>
+      </w:r>
+      <w:proofErr w:type="spellStart"/>
+      <w:r>
+        <w:t>git</w:t>
+      </w:r>
+      <w:proofErr w:type="spellEnd"/>
+      <w:r>
+        <w:t xml:space="preserve"> </w:t>
+      </w:r>
+      <w:proofErr w:type="spellStart"/>
+      <w:r>
+        <w:t>commit</w:t>
+      </w:r>
+      <w:proofErr w:type="spellEnd"/>
+      <w:r>
+        <w:t xml:space="preserve">, menos m, dizendo que eu </w:t>
+      </w:r>
+      <w:proofErr w:type="gramStart"/>
+      <w:r>
+        <w:t>estou, adicionando</w:t>
+      </w:r>
+      <w:proofErr w:type="gramEnd"/>
+      <w:r>
+        <w:t xml:space="preserve">, o arquivo inicial com teste de login. Prontinho? Agora eu vou fazer </w:t>
+      </w:r>
+      <w:proofErr w:type="spellStart"/>
+      <w:r>
+        <w:t>Git</w:t>
+      </w:r>
+      <w:proofErr w:type="spellEnd"/>
+      <w:r>
+        <w:t xml:space="preserve"> </w:t>
+      </w:r>
+      <w:proofErr w:type="spellStart"/>
+      <w:r>
+        <w:t>branch</w:t>
+      </w:r>
+      <w:proofErr w:type="spellEnd"/>
+      <w:r>
+        <w:t xml:space="preserve"> pra ver o nome da minha </w:t>
+      </w:r>
+      <w:proofErr w:type="spellStart"/>
+      <w:r>
+        <w:t>branch</w:t>
+      </w:r>
+      <w:proofErr w:type="spellEnd"/>
+      <w:r>
+        <w:t xml:space="preserve">. Ela está aqui, a </w:t>
+      </w:r>
+      <w:proofErr w:type="spellStart"/>
+      <w:r>
+        <w:t>branch</w:t>
+      </w:r>
+      <w:proofErr w:type="spellEnd"/>
+      <w:r>
+        <w:t xml:space="preserve"> iniciando o projeto, vou copiar. Eu vou vir aqui, fazer </w:t>
+      </w:r>
+      <w:proofErr w:type="spellStart"/>
+      <w:r>
+        <w:t>git</w:t>
+      </w:r>
+      <w:proofErr w:type="spellEnd"/>
+      <w:r>
+        <w:t xml:space="preserve"> </w:t>
+      </w:r>
+      <w:proofErr w:type="spellStart"/>
+      <w:r>
+        <w:t>push</w:t>
+      </w:r>
+      <w:proofErr w:type="spellEnd"/>
+      <w:r>
+        <w:t xml:space="preserve"> </w:t>
+      </w:r>
+      <w:proofErr w:type="spellStart"/>
+      <w:r>
+        <w:t>origin</w:t>
+      </w:r>
+      <w:proofErr w:type="spellEnd"/>
+      <w:r>
+        <w:t xml:space="preserve">, e vou colocar aqui o nome da minha </w:t>
+      </w:r>
+      <w:proofErr w:type="spellStart"/>
+      <w:r>
+        <w:t>branch</w:t>
+      </w:r>
+      <w:proofErr w:type="spellEnd"/>
+      <w:r>
+        <w:t xml:space="preserve">, </w:t>
+      </w:r>
+      <w:proofErr w:type="spellStart"/>
+      <w:r>
+        <w:t>enter</w:t>
+      </w:r>
+      <w:proofErr w:type="spellEnd"/>
+      <w:r>
+        <w:t xml:space="preserve">. Prontinho, agora sim já está </w:t>
+      </w:r>
+      <w:proofErr w:type="spellStart"/>
+      <w:r>
+        <w:t>versionado</w:t>
+      </w:r>
+      <w:proofErr w:type="spellEnd"/>
+      <w:r>
+        <w:t xml:space="preserve">. Se eu entrar nesse meu projeto aqui, né, que é o projeto do, do banco performance. A gente vira aqui olha, e mudar para a gente iniciar no projeto. Já vamos conseguir vir aqui na pasta testes, login teste, e ver esse nosso teste que foi criado, ok? Beleza. Na próxima aula a gente vai aprender a fazer 1 mudança aqui nesse arquivo, pra poder aproximar ele mais do que é teste de performance comum, com a simulação de diversos usuários virtuais. Porque até agora, o que a gente fez foi apenas repetir esse nosso teste aqui, 50 vezes através desse dessa opção </w:t>
+      </w:r>
+      <w:proofErr w:type="spellStart"/>
+      <w:r>
+        <w:t>iterations</w:t>
+      </w:r>
+      <w:proofErr w:type="spellEnd"/>
+      <w:r>
+        <w:t>. Na próxima aula a gente aprende mais sobre usuários virtuais. Eu te vejo lá.</w:t>
+      </w:r>
+    </w:p>
+    <w:p>
+      <w:pPr>
+        <w:spacing w:after="0"/>
+      </w:pPr>
+      <w:r>
+        <w:lastRenderedPageBreak/>
         <w:pict w14:anchorId="574CE202">
           <v:rect id="_x0000_i1040" style="width:0;height:1.5pt" o:hralign="center" o:bullet="t" o:hrstd="t" o:hr="t" fillcolor="#a0a0a0" stroked="f"/>
         </w:pict>
@@ -4012,7 +5449,10 @@
     </w:p>
     <w:p>
       <w:pPr>
-        <w:spacing w:after="0"/>
+        <w:rPr>
+          <w:b/>
+          <w:bCs/>
+        </w:rPr>
       </w:pPr>
       <w:r>
         <w:rPr>
@@ -4021,6 +5461,869 @@
         </w:rPr>
         <w:t xml:space="preserve">12. </w:t>
       </w:r>
+      <w:r>
+        <w:rPr>
+          <w:b/>
+          <w:bCs/>
+        </w:rPr>
+        <w:t>Adicionando usuários virtuais</w:t>
+      </w:r>
+    </w:p>
+    <w:p>
+      <w:pPr>
+        <w:spacing w:after="0"/>
+      </w:pPr>
+      <w:r>
+        <w:t xml:space="preserve">Bem, vamos lá. A partir de agora eu quero mostrar pra você outro recurso que é muito comum quando a gente fala de testes de performance, que é a utilização de usuários virtuais, ok? São chamados de virtual </w:t>
+      </w:r>
+      <w:proofErr w:type="spellStart"/>
+      <w:r>
+        <w:t>users</w:t>
+      </w:r>
+      <w:proofErr w:type="spellEnd"/>
+      <w:r>
+        <w:t xml:space="preserve">, em inglês. Como funciona essa questão de utilização de virtual </w:t>
+      </w:r>
+      <w:proofErr w:type="spellStart"/>
+      <w:r>
+        <w:t>users</w:t>
+      </w:r>
+      <w:proofErr w:type="spellEnd"/>
+      <w:r>
+        <w:t xml:space="preserve">? Imagina que você tem aqui o seu teste, e que você quer que ele seja executado no modo </w:t>
+      </w:r>
+      <w:proofErr w:type="spellStart"/>
+      <w:r>
+        <w:t>iterations</w:t>
+      </w:r>
+      <w:proofErr w:type="spellEnd"/>
+      <w:r>
+        <w:t xml:space="preserve">. Ele vai ser executado esse teste a por vez, né, sequencialmente. Quando a gente tem usuários virtuais, é como se a gente falasse assim, olha, está aqui 10 usuários virtuais, ok? Cada deles representado aqui por dos meus dedos. E eu falo para cada deles, gente, está aqui olha, esse daqui é o teste que eu quero que cada de vocês execute. E aí tem lá aqueles 10, eles já estão com os testes que eles têm que executar e já estão preparados. Qual é esse teste? O teste que a gente escreveu aqui olha. Esse teste que a gente escreveu aqui olha, dentro da </w:t>
+      </w:r>
+      <w:proofErr w:type="gramStart"/>
+      <w:r>
+        <w:t>nossa default</w:t>
+      </w:r>
+      <w:proofErr w:type="gramEnd"/>
+      <w:r>
+        <w:t xml:space="preserve"> </w:t>
+      </w:r>
+      <w:proofErr w:type="spellStart"/>
+      <w:r>
+        <w:t>function</w:t>
+      </w:r>
+      <w:proofErr w:type="spellEnd"/>
+      <w:r>
+        <w:t xml:space="preserve">, está vendo? Ou seja, cada 1 dessas 10 pessoas vai ter que preparar esse </w:t>
+      </w:r>
+      <w:proofErr w:type="spellStart"/>
+      <w:r>
+        <w:t>payload</w:t>
+      </w:r>
+      <w:proofErr w:type="spellEnd"/>
+      <w:r>
+        <w:t xml:space="preserve">, pegar essa URL, pegar esse </w:t>
+      </w:r>
+      <w:proofErr w:type="spellStart"/>
+      <w:r>
+        <w:t>application</w:t>
+      </w:r>
+      <w:proofErr w:type="spellEnd"/>
+      <w:r>
+        <w:t xml:space="preserve"> JSON e, boom, enviar </w:t>
+      </w:r>
+      <w:proofErr w:type="gramStart"/>
+      <w:r>
+        <w:t>esse essa requisição</w:t>
+      </w:r>
+      <w:proofErr w:type="gramEnd"/>
+      <w:r>
+        <w:t xml:space="preserve"> e depois validar que o status é 200 e que o token é </w:t>
+      </w:r>
+      <w:proofErr w:type="spellStart"/>
+      <w:r>
+        <w:t>string</w:t>
+      </w:r>
+      <w:proofErr w:type="spellEnd"/>
+      <w:r>
+        <w:t xml:space="preserve">, cada desses 10 aqui. E aí o que eu vou falar? Vou falar, vai lá vocês 10 agora e executem. E aí os 10 juntos começam e executam. É claro, hora ou outra tem atrasadinho né? Eu falei, vai gente, daí ele estava lá no celular, esperou pouquinho depois, opa, tem que fazer o teste e começou a fazer, tem outro que não ouviu e falando que só começou depois, entendeu? Mas eles vão sair relativamente simultâneos, ok? Estou dando esses </w:t>
+      </w:r>
+      <w:proofErr w:type="spellStart"/>
+      <w:r>
+        <w:t>esses</w:t>
+      </w:r>
+      <w:proofErr w:type="spellEnd"/>
+      <w:r>
+        <w:t xml:space="preserve"> exemplos aqui de como seria na vida real, mas quando a gente fala do computador esses usuários virtuais podem atrasar pouco porque o processador estava pouco devagar ou porque a memória estava muito, sendo muito utilizada, entendeu? Então isso também acontece no universo digital, está bom? Certo, é que eu tenho esses usuários virtuais. E isso muda o jogo, porque no final das contas, durante teste de performance é isso que vai acontecer. Se a gente fala que vai ter 1000 usuários usando, eles não vão estar, entrou, 2 entrou, o 3 entrou e o, sabe, o entrou, o 2 entrou e o saiu, o 3 entrou e o 2 saiu. Não, eles vão estar todo mundo junto lá, entendeu? Podem existir variações. Por exemplo, olha, nos primeiros 10 segundos entra 5, depois nos </w:t>
+      </w:r>
+      <w:proofErr w:type="spellStart"/>
+      <w:r>
+        <w:t>nos</w:t>
+      </w:r>
+      <w:proofErr w:type="spellEnd"/>
+      <w:r>
+        <w:t xml:space="preserve"> do 2º 10 até o 20 entra 30, depois do 30, do 20 até o do 30 entra 40, entendeu? A gente pode fazer essas </w:t>
+      </w:r>
+      <w:proofErr w:type="spellStart"/>
+      <w:r>
+        <w:t>essas</w:t>
+      </w:r>
+      <w:proofErr w:type="spellEnd"/>
+      <w:r>
+        <w:t xml:space="preserve"> variações também, que inclusive a gente vai aprender na próxima aula, está bom? Mas, né, temos aí essas possibilidades, ok? Então entenda que usuários virtuais é o que a gente vai usar no nosso dia a dia, está bom? Essa questão sequencial que a gente usou aqui com os </w:t>
+      </w:r>
+      <w:proofErr w:type="spellStart"/>
+      <w:r>
+        <w:t>iterations</w:t>
+      </w:r>
+      <w:proofErr w:type="spellEnd"/>
+      <w:r>
+        <w:t xml:space="preserve">, é algo que a gente estava usando só pra que você pudesse entender qual é a mecânica do k 6. Fechado assim? Ótimo. Então eu vou voltar lá pro </w:t>
+      </w:r>
+      <w:proofErr w:type="spellStart"/>
+      <w:r>
+        <w:t>pro</w:t>
+      </w:r>
+      <w:proofErr w:type="spellEnd"/>
+      <w:r>
+        <w:t xml:space="preserve"> browser, eu estou aqui em </w:t>
+      </w:r>
+      <w:proofErr w:type="spellStart"/>
+      <w:r>
+        <w:t>get</w:t>
+      </w:r>
+      <w:proofErr w:type="spellEnd"/>
+      <w:r>
+        <w:t xml:space="preserve"> </w:t>
+      </w:r>
+      <w:proofErr w:type="spellStart"/>
+      <w:r>
+        <w:t>started</w:t>
+      </w:r>
+      <w:proofErr w:type="spellEnd"/>
+      <w:r>
+        <w:t xml:space="preserve">, running k </w:t>
+      </w:r>
+      <w:proofErr w:type="spellStart"/>
+      <w:r>
+        <w:t>six</w:t>
+      </w:r>
+      <w:proofErr w:type="spellEnd"/>
+      <w:r>
+        <w:t xml:space="preserve">. E aqui ele fala sobre caminho né, que a gente vai seguir que é rodar o teste, adicionar usuários virtuais, aumentar a duração do teste, aumentar o número de </w:t>
+      </w:r>
+      <w:proofErr w:type="spellStart"/>
+      <w:r>
+        <w:t>de</w:t>
+      </w:r>
+      <w:proofErr w:type="spellEnd"/>
+      <w:r>
+        <w:t xml:space="preserve"> </w:t>
+      </w:r>
+      <w:proofErr w:type="spellStart"/>
+      <w:r>
+        <w:t>requests</w:t>
+      </w:r>
+      <w:proofErr w:type="spellEnd"/>
+      <w:r>
+        <w:t xml:space="preserve"> e depois diminuir o a execução dos testes. E aqui ele traz esse tutorial. Então ele fala olha, é desse jeito aqui que você adiciona </w:t>
+      </w:r>
+      <w:proofErr w:type="gramStart"/>
+      <w:r>
+        <w:t>os virtual</w:t>
+      </w:r>
+      <w:proofErr w:type="gramEnd"/>
+      <w:r>
+        <w:t xml:space="preserve"> </w:t>
+      </w:r>
+      <w:proofErr w:type="spellStart"/>
+      <w:r>
+        <w:t>users</w:t>
+      </w:r>
+      <w:proofErr w:type="spellEnd"/>
+      <w:r>
+        <w:t xml:space="preserve">, os usuários virtuais. Você pega o seu script e fala que você vai rodar com 10 usuários virtuais com 1 duração de 30 segundos. Então durante 30 segundos vão ter 10 pessoinhas rodando o script que você apontou aqui, entendeu? Você define </w:t>
+      </w:r>
+      <w:proofErr w:type="gramStart"/>
+      <w:r>
+        <w:t>o quantidade</w:t>
+      </w:r>
+      <w:proofErr w:type="gramEnd"/>
+      <w:r>
+        <w:t xml:space="preserve"> de números virtuais e a quantidade de duração do teste. Isso daqui é você rodando isso via linha de comando, mas tem jeito de você fazer isso também via código, que o que a gente vai fazer aqui, que é você ir lá dentro das suas </w:t>
+      </w:r>
+      <w:proofErr w:type="spellStart"/>
+      <w:r>
+        <w:t>options</w:t>
+      </w:r>
+      <w:proofErr w:type="spellEnd"/>
+      <w:r>
+        <w:t xml:space="preserve"> e colocar o número de v </w:t>
+      </w:r>
+      <w:proofErr w:type="spellStart"/>
+      <w:r>
+        <w:t>u's</w:t>
+      </w:r>
+      <w:proofErr w:type="spellEnd"/>
+      <w:r>
+        <w:t xml:space="preserve">, é o número de usuários virtuais, o número da, e o tempo de duração, onde você quer que dure a execução desse teste. Isso aqui que a gente vai fazer, está bom? Mas daí ele vem aqui olha, e mostra pra gente também como como você pode usar os </w:t>
+      </w:r>
+      <w:proofErr w:type="spellStart"/>
+      <w:r>
+        <w:t>stages</w:t>
+      </w:r>
+      <w:proofErr w:type="spellEnd"/>
+      <w:r>
+        <w:t xml:space="preserve">, olha só que legal. Os </w:t>
+      </w:r>
+      <w:proofErr w:type="spellStart"/>
+      <w:r>
+        <w:t>stages</w:t>
+      </w:r>
+      <w:proofErr w:type="spellEnd"/>
+      <w:r>
+        <w:t xml:space="preserve"> são esses momentos aqui onde você fala, olha, agora eu quero, durante os 30 segundos eu quero 20 usuários, depois durante minuto e meio eu quero só 10, e depois eu quero só, eu quero que nos próximos 20 segundos a gente chegue até 0 usuários, entendeu? Vamos fazer por partes. Então 1º a gente aprende esse daqui, depois na próxima aula a gente aprende esse daqui, está bom? Vamos lá. Número de usuários </w:t>
+      </w:r>
+      <w:r>
+        <w:lastRenderedPageBreak/>
+        <w:t xml:space="preserve">virtuais, duração. Como que a gente vai fazer isso no nosso script? Vou vir aqui no script, está vendo? E aqui olha, em cima, ao invés de </w:t>
+      </w:r>
+      <w:proofErr w:type="spellStart"/>
+      <w:r>
+        <w:t>iterations</w:t>
+      </w:r>
+      <w:proofErr w:type="spellEnd"/>
+      <w:r>
+        <w:t xml:space="preserve">, eu vou tirar o </w:t>
+      </w:r>
+      <w:proofErr w:type="spellStart"/>
+      <w:r>
+        <w:t>iterations</w:t>
+      </w:r>
+      <w:proofErr w:type="spellEnd"/>
+      <w:r>
+        <w:t xml:space="preserve">. Tiro ele, eu vou colocar aqui olha, v </w:t>
+      </w:r>
+      <w:proofErr w:type="spellStart"/>
+      <w:r>
+        <w:t>u's</w:t>
+      </w:r>
+      <w:proofErr w:type="spellEnd"/>
+      <w:r>
+        <w:t xml:space="preserve">. E falo quantos usuários virtuais eu quero, vamos dizer que fossem 10, vírgula, eu venho aqui e coloco o </w:t>
+      </w:r>
+      <w:proofErr w:type="spellStart"/>
+      <w:r>
+        <w:t>duration</w:t>
+      </w:r>
+      <w:proofErr w:type="spellEnd"/>
+      <w:r>
+        <w:t xml:space="preserve">, ok? E o </w:t>
+      </w:r>
+      <w:proofErr w:type="spellStart"/>
+      <w:r>
+        <w:t>duration</w:t>
+      </w:r>
+      <w:proofErr w:type="spellEnd"/>
+      <w:r>
+        <w:t xml:space="preserve"> ele é entre aspas simples aqui olha, e eu coloco quanto tempo que eu quero que fique executando. Então eu vou falar aqui que eu quero ficar executando, sei lá, por 30 segundos, 30 s, está bom? Então, é desse jeito aqui que eu quero que que isso aconteça, eu quero que </w:t>
+      </w:r>
+      <w:proofErr w:type="gramStart"/>
+      <w:r>
+        <w:t>10 pessoinhas, durante 30 segundos, fique</w:t>
+      </w:r>
+      <w:proofErr w:type="gramEnd"/>
+      <w:r>
+        <w:t xml:space="preserve"> executando essa </w:t>
+      </w:r>
+      <w:proofErr w:type="gramStart"/>
+      <w:r>
+        <w:t>nossa default</w:t>
+      </w:r>
+      <w:proofErr w:type="gramEnd"/>
+      <w:r>
+        <w:t xml:space="preserve"> </w:t>
+      </w:r>
+      <w:proofErr w:type="spellStart"/>
+      <w:r>
+        <w:t>function</w:t>
+      </w:r>
+      <w:proofErr w:type="spellEnd"/>
+      <w:r>
+        <w:t xml:space="preserve"> aqui. Mas </w:t>
+      </w:r>
+      <w:proofErr w:type="spellStart"/>
+      <w:r>
+        <w:t>Julio</w:t>
+      </w:r>
+      <w:proofErr w:type="spellEnd"/>
+      <w:r>
+        <w:t xml:space="preserve">, você não falou qual era a função que você queria que eles executassem, não precisa. Eles vão executar o que estiver declarado como default </w:t>
+      </w:r>
+      <w:proofErr w:type="spellStart"/>
+      <w:r>
+        <w:t>function</w:t>
+      </w:r>
+      <w:proofErr w:type="spellEnd"/>
+      <w:r>
+        <w:t xml:space="preserve">. </w:t>
+      </w:r>
+      <w:proofErr w:type="spellStart"/>
+      <w:r>
+        <w:t>Julio</w:t>
+      </w:r>
+      <w:proofErr w:type="spellEnd"/>
+      <w:r>
+        <w:t xml:space="preserve">, mas e se tiver 2? Não pode ter 2, só pode ter 1 default </w:t>
+      </w:r>
+      <w:proofErr w:type="spellStart"/>
+      <w:r>
+        <w:t>function</w:t>
+      </w:r>
+      <w:proofErr w:type="spellEnd"/>
+      <w:r>
+        <w:t xml:space="preserve">, ok? O que estiver aqui dentro vai ser executado por eles. Vou salvar, e agora vou vir aqui e vou executar, só que olha só, só pra gente esse, ajustar as coisas aqui, a gente colocou esse esses nossos </w:t>
+      </w:r>
+      <w:proofErr w:type="spellStart"/>
+      <w:r>
+        <w:t>thresholds</w:t>
+      </w:r>
+      <w:proofErr w:type="spellEnd"/>
+      <w:r>
+        <w:t xml:space="preserve"> aqui no passado, enquanto a gente estava aprendendo sobre </w:t>
+      </w:r>
+      <w:proofErr w:type="spellStart"/>
+      <w:r>
+        <w:t>thresholds</w:t>
+      </w:r>
+      <w:proofErr w:type="spellEnd"/>
+      <w:r>
+        <w:t xml:space="preserve">, e eu falei pra você colocar aqui esses valores malucos né, de tipo </w:t>
+      </w:r>
+      <w:proofErr w:type="spellStart"/>
+      <w:r>
+        <w:t>max</w:t>
+      </w:r>
+      <w:proofErr w:type="spellEnd"/>
+      <w:r>
+        <w:t xml:space="preserve"> menor do que p 90 menor do que 10, por quê? Porque a gente estava aprendendo, né? Vamos colocar isso daqui de jeito </w:t>
+      </w:r>
+      <w:proofErr w:type="gramStart"/>
+      <w:r>
+        <w:t>pouco mais</w:t>
+      </w:r>
+      <w:proofErr w:type="gramEnd"/>
+      <w:r>
+        <w:t xml:space="preserve"> </w:t>
+      </w:r>
+      <w:proofErr w:type="spellStart"/>
+      <w:r>
+        <w:t>mais</w:t>
+      </w:r>
+      <w:proofErr w:type="spellEnd"/>
+      <w:r>
+        <w:t xml:space="preserve"> real, né? Vamos vir aqui e vou colocar. Aqui que eu quero que esse p 90 seja menor que 3000, está bom? E aqui eu nem vou precisar desse </w:t>
+      </w:r>
+      <w:proofErr w:type="spellStart"/>
+      <w:r>
+        <w:t>max</w:t>
+      </w:r>
+      <w:proofErr w:type="spellEnd"/>
+      <w:r>
+        <w:t xml:space="preserve"> mais, vou colocar aqui menor que 10000? Só pra gente, vamos colocar junto assim né, vamos colocar aqui menor que 5000, eu acho que fica mais, parece mais parecido com a realidade né? Então o que a gente está dizendo aqui é que olha, o percentil de 90, que é 90 por 100 dos nossos usuários, tem que receber tempo de duração, </w:t>
+      </w:r>
+      <w:proofErr w:type="spellStart"/>
+      <w:r>
+        <w:t>request</w:t>
+      </w:r>
+      <w:proofErr w:type="spellEnd"/>
+      <w:r>
+        <w:t xml:space="preserve"> </w:t>
+      </w:r>
+      <w:proofErr w:type="spellStart"/>
+      <w:r>
+        <w:t>duration</w:t>
+      </w:r>
+      <w:proofErr w:type="spellEnd"/>
+      <w:r>
+        <w:t xml:space="preserve">, menor do que 3000, beleza? E olha só, o máximo, ou seja, o </w:t>
+      </w:r>
+      <w:proofErr w:type="spellStart"/>
+      <w:r>
+        <w:t>o</w:t>
+      </w:r>
+      <w:proofErr w:type="spellEnd"/>
+      <w:r>
+        <w:t xml:space="preserve"> a requisição com o tempo maior não pode passar de 5000 também, está bom? O que a gente colocou aqui. A gente também não pode ter erro, né? </w:t>
+      </w:r>
+      <w:proofErr w:type="gramStart"/>
+      <w:r>
+        <w:t>Na verdade</w:t>
+      </w:r>
+      <w:proofErr w:type="gramEnd"/>
+      <w:r>
+        <w:t xml:space="preserve"> a gente pode ter tecnicamente, né? Menos de por 100 dos erros, está bom? Mas é número muito pequeno, ok? Então o importante é aqui olha, 10 pessoas vão rodar isso daqui durante 30 segundos. Você lembra quando a gente estava com o </w:t>
+      </w:r>
+      <w:proofErr w:type="spellStart"/>
+      <w:r>
+        <w:t>iterations</w:t>
+      </w:r>
+      <w:proofErr w:type="spellEnd"/>
+      <w:r>
+        <w:t xml:space="preserve">? A gente colocava 50, quantas requisições tinha no final? 50, não era assim? Agora quando a gente está colocando aqui 10 pessoas, 30 segundos lá tacando o pau na execução do teste, o número de requisições sempre vai ser variável, porque a gente não sabe quantas requisições dá pra fazer, né, durante esse </w:t>
+      </w:r>
+      <w:proofErr w:type="spellStart"/>
+      <w:r>
+        <w:t>esse</w:t>
+      </w:r>
+      <w:proofErr w:type="spellEnd"/>
+      <w:r>
+        <w:t xml:space="preserve"> tempo aqui, beleza? Então a gente vai colocar esses usuários pra rodar e a gente vai acompanhar o que que vai acontecer durante esses 30 segundos. Como são 30 segundos, a gente pode até assistir diretamente lá no browser, igual a gente fazia com aquele nosso </w:t>
+      </w:r>
+      <w:proofErr w:type="spellStart"/>
+      <w:r>
+        <w:t>comandinho</w:t>
+      </w:r>
+      <w:proofErr w:type="spellEnd"/>
+      <w:r>
+        <w:t xml:space="preserve"> né, de adicionar o dashboard web liberado aqui durante a execução. Vamos fazer isso. Vou vir aqui embaixo olha, 1º né, vou salvar, pronto, já está salvo. Vou vir aqui, vou apertar pra cima até chegar aquele comando, </w:t>
+      </w:r>
+      <w:proofErr w:type="gramStart"/>
+      <w:r>
+        <w:t>É</w:t>
+      </w:r>
+      <w:proofErr w:type="gramEnd"/>
+      <w:r>
+        <w:t xml:space="preserve"> o comando do formulário, né? Então está aqui olha. Gerar o formulário dinâmico </w:t>
+      </w:r>
+      <w:proofErr w:type="spellStart"/>
+      <w:r>
+        <w:t>true</w:t>
+      </w:r>
+      <w:proofErr w:type="spellEnd"/>
+      <w:r>
+        <w:t xml:space="preserve">, gerar o formulário em HTML, estou colocando aqui qual é o relatório HTML e aqui está o comando do k 6 de execução, </w:t>
+      </w:r>
+      <w:proofErr w:type="gramStart"/>
+      <w:r>
+        <w:t>Vou</w:t>
+      </w:r>
+      <w:proofErr w:type="gramEnd"/>
+      <w:r>
+        <w:t xml:space="preserve"> dar </w:t>
+      </w:r>
+      <w:proofErr w:type="spellStart"/>
+      <w:r>
+        <w:t>enter</w:t>
+      </w:r>
+      <w:proofErr w:type="spellEnd"/>
+      <w:r>
+        <w:t xml:space="preserve">, vou lá direto aqui olha, pra essa página, né? Que que você dá 1, discutir para ele ali? Resultado. Fazer cocô, você vai ganhar 1 porrada mais o que está aqui olha, 6 </w:t>
+      </w:r>
+      <w:proofErr w:type="spellStart"/>
+      <w:r>
+        <w:t>equilinos</w:t>
+      </w:r>
+      <w:proofErr w:type="spellEnd"/>
+      <w:r>
+        <w:t xml:space="preserve"> por 2º. Por enquanto, o tempo de </w:t>
+      </w:r>
+      <w:proofErr w:type="spellStart"/>
+      <w:r>
+        <w:t>de</w:t>
+      </w:r>
+      <w:proofErr w:type="spellEnd"/>
+      <w:r>
+        <w:t xml:space="preserve"> resposta média aqui está sendo de 6 milissegundos. Olha só, ele já está mostrando aqui pra gente, o </w:t>
+      </w:r>
+      <w:proofErr w:type="spellStart"/>
+      <w:r>
+        <w:t>o</w:t>
+      </w:r>
+      <w:proofErr w:type="spellEnd"/>
+      <w:r>
+        <w:t xml:space="preserve"> a forma de execução que está acontecendo, está vendo? Então aqui ele mostra pra gente o </w:t>
+      </w:r>
+      <w:proofErr w:type="spellStart"/>
+      <w:r>
+        <w:t>request</w:t>
+      </w:r>
+      <w:proofErr w:type="spellEnd"/>
+      <w:r>
+        <w:t xml:space="preserve"> rate, que é a quantidade de </w:t>
+      </w:r>
+      <w:proofErr w:type="spellStart"/>
+      <w:r>
+        <w:t>de</w:t>
+      </w:r>
+      <w:proofErr w:type="spellEnd"/>
+      <w:r>
+        <w:t xml:space="preserve"> requisições sendo enviadas, são 10 por 2º. A duração do p 95 olha, está aqui já na casa dos 11 milissegundos, está vendo? E aqui está executando. E já está gerando aqui pra gente as métricas com relação </w:t>
+      </w:r>
+      <w:proofErr w:type="spellStart"/>
+      <w:r>
+        <w:t>a</w:t>
+      </w:r>
+      <w:proofErr w:type="spellEnd"/>
+      <w:r>
+        <w:t xml:space="preserve"> essa execução. Se eu volto lá pro Visual Studio </w:t>
+      </w:r>
+      <w:proofErr w:type="spellStart"/>
+      <w:r>
+        <w:t>Code</w:t>
+      </w:r>
+      <w:proofErr w:type="spellEnd"/>
+      <w:r>
+        <w:t xml:space="preserve">, olha só, eu já vejo que aqui ele já terminou a execução, ok? E olha só, aqui ele vai trazer pra gente algumas informações. Como por exemplo olha, foram 10 usuários virtuais durante 30 segundos, e aqui ele mostra que estava lá durante aqueles 30 segundos rodando aqui esses usuários, e ele deu aqui. E ele deu aqui total de 300 requisições sendo enviadas, ok? O número aqui ficou número uniforme por quê? Porque a cada requisição que a gente mandou aqui, a gente deu esse </w:t>
+      </w:r>
+      <w:proofErr w:type="spellStart"/>
+      <w:r>
+        <w:t>slip</w:t>
+      </w:r>
+      <w:proofErr w:type="spellEnd"/>
+      <w:r>
+        <w:t xml:space="preserve"> de 2º, então cada requisição está demorando aqui 2º pra ser executada, ok? Volta aqui que </w:t>
+      </w:r>
+      <w:r>
+        <w:lastRenderedPageBreak/>
+        <w:t xml:space="preserve">você vai lá cagar junto com ela, a gente vai lá cagar junto com ela. Volta aqui. Vai apagar lá fora, aquela ponta. </w:t>
+      </w:r>
+      <w:proofErr w:type="spellStart"/>
+      <w:r>
+        <w:t>En</w:t>
+      </w:r>
+      <w:proofErr w:type="spellEnd"/>
+      <w:r>
+        <w:t xml:space="preserve"> </w:t>
+      </w:r>
+      <w:proofErr w:type="spellStart"/>
+      <w:r>
+        <w:t>el</w:t>
+      </w:r>
+      <w:proofErr w:type="spellEnd"/>
+      <w:r>
+        <w:t xml:space="preserve"> frouxo do </w:t>
+      </w:r>
+      <w:proofErr w:type="spellStart"/>
+      <w:r>
+        <w:t>carajo</w:t>
+      </w:r>
+      <w:proofErr w:type="spellEnd"/>
+      <w:r>
+        <w:t xml:space="preserve">. Vou voltar aqui então pro Chrome, já vejo aqui então os dados quanto à execução, vejo aqui olha, o quanto que foi a questão da </w:t>
+      </w:r>
+      <w:proofErr w:type="spellStart"/>
+      <w:r>
+        <w:t>da</w:t>
+      </w:r>
+      <w:proofErr w:type="spellEnd"/>
+      <w:r>
+        <w:t xml:space="preserve"> duração, está vendo? Se eu vier aqui e falo assim olha, deixa eu ver só o </w:t>
+      </w:r>
+      <w:proofErr w:type="spellStart"/>
+      <w:r>
+        <w:t>request</w:t>
+      </w:r>
+      <w:proofErr w:type="spellEnd"/>
+      <w:r>
+        <w:t xml:space="preserve"> </w:t>
+      </w:r>
+      <w:proofErr w:type="spellStart"/>
+      <w:r>
+        <w:t>duration</w:t>
+      </w:r>
+      <w:proofErr w:type="spellEnd"/>
+      <w:r>
+        <w:t xml:space="preserve">, quanto foi. Vejo aqui olha, que o percentil de 95 olha, ele chegou até o período aqui, o tempo aqui de duração de 11 milissegundos, aquele mesmo esquema. Se na </w:t>
+      </w:r>
+      <w:proofErr w:type="spellStart"/>
+      <w:r>
+        <w:t>na</w:t>
+      </w:r>
+      <w:proofErr w:type="spellEnd"/>
+      <w:r>
+        <w:t xml:space="preserve"> sua empresa a galera falou que o percentual de 95 tem que ser de 15 milissegundos, nossos testes estão ok. Se eles falaram que é 10, já tivemos problemas, porque a gente teve aqui olha, tempos de resposta chegando até esse total, ok? E aqui eu posso ter todas aquelas métricas que a gente já conhece, né? Se eu vier aqui, no v s </w:t>
+      </w:r>
+      <w:proofErr w:type="spellStart"/>
+      <w:r>
+        <w:t>code</w:t>
+      </w:r>
+      <w:proofErr w:type="spellEnd"/>
+      <w:r>
+        <w:t xml:space="preserve">, clicar aqui no botão direito no </w:t>
+      </w:r>
+      <w:proofErr w:type="spellStart"/>
+      <w:r>
+        <w:t>html</w:t>
+      </w:r>
+      <w:proofErr w:type="spellEnd"/>
+      <w:r>
+        <w:t xml:space="preserve"> me, </w:t>
+      </w:r>
+      <w:proofErr w:type="spellStart"/>
+      <w:r>
+        <w:t>port</w:t>
+      </w:r>
+      <w:proofErr w:type="spellEnd"/>
+      <w:r>
+        <w:t xml:space="preserve">, certo? Mostrar lá no </w:t>
+      </w:r>
+      <w:proofErr w:type="spellStart"/>
+      <w:r>
+        <w:t>Finder</w:t>
+      </w:r>
+      <w:proofErr w:type="spellEnd"/>
+      <w:r>
+        <w:t xml:space="preserve"> e dar 2 cliques nele. Olha só, ele me mostra aqui também esse relatório, mas novamente esse daqui não é o dinâmico, né? Tem todas aquelas informações e aqui embaixo tem aquela tabela, aquela tabela super bacana. E mostra pra gente aqui olha, né, as informações com relação às métricas. Então ele fala aqui por exemplo, que o HTTP </w:t>
+      </w:r>
+      <w:proofErr w:type="spellStart"/>
+      <w:r>
+        <w:t>request</w:t>
+      </w:r>
+      <w:proofErr w:type="spellEnd"/>
+      <w:r>
+        <w:t xml:space="preserve"> </w:t>
+      </w:r>
+      <w:proofErr w:type="spellStart"/>
+      <w:r>
+        <w:t>duration</w:t>
+      </w:r>
+      <w:proofErr w:type="spellEnd"/>
+      <w:r>
+        <w:t xml:space="preserve">, está vendo olha, na média foi 5 milissegundos, máximo, média, ou desculpa, mediana, o mínimo percentual de 90, de 95 e de 99. Então aqui olha, nesses dados aqui você já consegue tirar aquilo que você espera, né, que é a informação que vai te ajudar a definir se o teste passou ou não. Então novamente, o time falou olha, </w:t>
+      </w:r>
+      <w:proofErr w:type="spellStart"/>
+      <w:r>
+        <w:t>Julio</w:t>
+      </w:r>
+      <w:proofErr w:type="spellEnd"/>
+      <w:r>
+        <w:t xml:space="preserve">, p 95 tem que ser 15 15 milissegundos, aqui a gente já está de boas, se fosse 10 já teríamos problema, entendeu? Ok? Ele também traz aqui pra gente essas informações aqui adicionais, quanto dados que foram recebidos, enviados, e olha só quantidade de requisições. O que aconteceu aqui? Foram 30 segundos de execução, dentro do nosso teste a gente tem 1 requisição de 2º, então quer dizer que cada requisição demorou pelo menos, cada execução de teste demorou pelo menos 2º. A gente tinha 10 usuários rodando a cada 2º 1 requisição, cada deles </w:t>
+      </w:r>
+      <w:proofErr w:type="gramStart"/>
+      <w:r>
+        <w:t>dá</w:t>
+      </w:r>
+      <w:proofErr w:type="gramEnd"/>
+      <w:r>
+        <w:t xml:space="preserve"> </w:t>
+      </w:r>
+      <w:proofErr w:type="spellStart"/>
+      <w:r>
+        <w:t>dá</w:t>
+      </w:r>
+      <w:proofErr w:type="spellEnd"/>
+      <w:r>
+        <w:t xml:space="preserve"> total aqui de 300 requisições, ok? Então foi isso daqui que aconteceu na nossa execução. Então agora a gente vê que a execução do teste não é mais por iteração, é sim por quantidade de usuários virtuais conectados versus o tempo, né, a duração que demora aquele determinado teste a ser executado. Então, com isso você entende agora que, quando você quer rodar com usuários virtuais, a questão é você vir aqui, dentro do </w:t>
+      </w:r>
+      <w:proofErr w:type="spellStart"/>
+      <w:r>
+        <w:t>const</w:t>
+      </w:r>
+      <w:proofErr w:type="spellEnd"/>
+      <w:r>
+        <w:t xml:space="preserve">, colocar o número de v </w:t>
+      </w:r>
+      <w:proofErr w:type="spellStart"/>
+      <w:r>
+        <w:t>u's</w:t>
+      </w:r>
+      <w:proofErr w:type="spellEnd"/>
+      <w:r>
+        <w:t xml:space="preserve">, que são os usuários virtuais, e a duração. Vamos lá agora então, </w:t>
+      </w:r>
+      <w:proofErr w:type="spellStart"/>
+      <w:r>
+        <w:t>versionar</w:t>
+      </w:r>
+      <w:proofErr w:type="spellEnd"/>
+      <w:r>
+        <w:t xml:space="preserve"> esse nosso novo script aqui, né? Então o que eu vou fazer? </w:t>
+      </w:r>
+      <w:proofErr w:type="spellStart"/>
+      <w:r>
+        <w:t>Git</w:t>
+      </w:r>
+      <w:proofErr w:type="spellEnd"/>
+      <w:r>
+        <w:t xml:space="preserve"> status. Vejo aqui esse meu script, vou fazer </w:t>
+      </w:r>
+      <w:proofErr w:type="spellStart"/>
+      <w:r>
+        <w:t>git</w:t>
+      </w:r>
+      <w:proofErr w:type="spellEnd"/>
+      <w:r>
+        <w:t xml:space="preserve"> </w:t>
+      </w:r>
+      <w:proofErr w:type="spellStart"/>
+      <w:r>
+        <w:t>add</w:t>
+      </w:r>
+      <w:proofErr w:type="spellEnd"/>
+      <w:r>
+        <w:t xml:space="preserve"> ponto nele. </w:t>
+      </w:r>
+      <w:proofErr w:type="spellStart"/>
+      <w:r>
+        <w:t>Git</w:t>
+      </w:r>
+      <w:proofErr w:type="spellEnd"/>
+      <w:r>
+        <w:t xml:space="preserve"> status de novo. Ele foi </w:t>
+      </w:r>
+      <w:proofErr w:type="spellStart"/>
+      <w:r>
+        <w:t>versionado</w:t>
+      </w:r>
+      <w:proofErr w:type="spellEnd"/>
+      <w:r>
+        <w:t xml:space="preserve"> aqui, ele foi adicionado no </w:t>
+      </w:r>
+      <w:proofErr w:type="spellStart"/>
+      <w:r>
+        <w:t>stage</w:t>
+      </w:r>
+      <w:proofErr w:type="spellEnd"/>
+      <w:r>
+        <w:t xml:space="preserve">, né? Vou vir aqui e vou fazer </w:t>
+      </w:r>
+      <w:proofErr w:type="spellStart"/>
+      <w:r>
+        <w:t>git</w:t>
+      </w:r>
+      <w:proofErr w:type="spellEnd"/>
+      <w:r>
+        <w:t xml:space="preserve"> </w:t>
+      </w:r>
+      <w:proofErr w:type="spellStart"/>
+      <w:r>
+        <w:t>commit</w:t>
+      </w:r>
+      <w:proofErr w:type="spellEnd"/>
+      <w:r>
+        <w:t xml:space="preserve"> menos </w:t>
+      </w:r>
+      <w:proofErr w:type="gramStart"/>
+      <w:r>
+        <w:t>m e</w:t>
+      </w:r>
+      <w:proofErr w:type="gramEnd"/>
+      <w:r>
+        <w:t xml:space="preserve"> aqui eu vou colocar 1 1 texto descritivo, né, falando o que que foi que aconteceu aqui. O que aconteceu foi que eu adicionei v </w:t>
+      </w:r>
+      <w:proofErr w:type="spellStart"/>
+      <w:r>
+        <w:t>u's</w:t>
+      </w:r>
+      <w:proofErr w:type="spellEnd"/>
+      <w:r>
+        <w:t xml:space="preserve"> e </w:t>
+      </w:r>
+      <w:proofErr w:type="spellStart"/>
+      <w:r>
+        <w:t>duration</w:t>
+      </w:r>
+      <w:proofErr w:type="spellEnd"/>
+      <w:r>
+        <w:t xml:space="preserve"> para a execução do teste. Ok? Prontinho. E agora, eu vou vir aqui e vou fazer aquele nosso </w:t>
+      </w:r>
+      <w:proofErr w:type="spellStart"/>
+      <w:r>
+        <w:t>push</w:t>
+      </w:r>
+      <w:proofErr w:type="spellEnd"/>
+      <w:r>
+        <w:t xml:space="preserve"> pra </w:t>
+      </w:r>
+      <w:proofErr w:type="spellStart"/>
+      <w:r>
+        <w:t>origin</w:t>
+      </w:r>
+      <w:proofErr w:type="spellEnd"/>
+      <w:r>
+        <w:t xml:space="preserve">, então eu só vou apertar aqui mais pra cima, e aqui eu vejo o </w:t>
+      </w:r>
+      <w:proofErr w:type="spellStart"/>
+      <w:r>
+        <w:t>git</w:t>
+      </w:r>
+      <w:proofErr w:type="spellEnd"/>
+      <w:r>
+        <w:t xml:space="preserve"> </w:t>
+      </w:r>
+      <w:proofErr w:type="spellStart"/>
+      <w:r>
+        <w:t>push</w:t>
+      </w:r>
+      <w:proofErr w:type="spellEnd"/>
+      <w:r>
+        <w:t xml:space="preserve"> </w:t>
+      </w:r>
+      <w:proofErr w:type="spellStart"/>
+      <w:r>
+        <w:t>origin</w:t>
+      </w:r>
+      <w:proofErr w:type="spellEnd"/>
+      <w:r>
+        <w:t xml:space="preserve"> e o nome da </w:t>
+      </w:r>
+      <w:proofErr w:type="spellStart"/>
+      <w:r>
+        <w:t>branch</w:t>
+      </w:r>
+      <w:proofErr w:type="spellEnd"/>
+      <w:r>
+        <w:t xml:space="preserve">. Prontinho, já subiu. Agora eu vou lá no meu GitHub, atualizo aqui, ok? E aí eu consigo ver aqui que nesse momento olha, já está aqui nesse arquivo que é o nosso login </w:t>
+      </w:r>
+      <w:proofErr w:type="spellStart"/>
+      <w:r>
+        <w:t>test</w:t>
+      </w:r>
+      <w:proofErr w:type="spellEnd"/>
+      <w:r>
+        <w:t xml:space="preserve">, a adição do v use </w:t>
+      </w:r>
+      <w:proofErr w:type="spellStart"/>
+      <w:r>
+        <w:t>duration</w:t>
+      </w:r>
+      <w:proofErr w:type="spellEnd"/>
+      <w:r>
+        <w:t xml:space="preserve"> para a execução dos testes, está aqui. Olha, </w:t>
+      </w:r>
+      <w:proofErr w:type="spellStart"/>
+      <w:r>
+        <w:t>Julio</w:t>
+      </w:r>
+      <w:proofErr w:type="spellEnd"/>
+      <w:r>
+        <w:t xml:space="preserve">, como eu faria para ver aquela outra versão do script? Vem aqui olha, no </w:t>
+      </w:r>
+      <w:proofErr w:type="spellStart"/>
+      <w:r>
+        <w:t>history</w:t>
+      </w:r>
+      <w:proofErr w:type="spellEnd"/>
+      <w:r>
+        <w:t xml:space="preserve">, e aqui olha, você pode vir aqui e clicar nesse seu outro </w:t>
+      </w:r>
+      <w:proofErr w:type="spellStart"/>
+      <w:r>
+        <w:t>commit</w:t>
+      </w:r>
+      <w:proofErr w:type="spellEnd"/>
+      <w:r>
+        <w:t xml:space="preserve">, está vendo que era adicionando arquivo inicial com teste de login. Clico aqui, eu consigo ver exatamente aquela versão do código. Então, isso fica legal assim da gente navegar em versões, né, porque conforme você vai aprendendo, vai </w:t>
+      </w:r>
+      <w:proofErr w:type="spellStart"/>
+      <w:r>
+        <w:t>versionando</w:t>
+      </w:r>
+      <w:proofErr w:type="spellEnd"/>
+      <w:r>
+        <w:t xml:space="preserve"> aqui e vai tendo essa flexibilidade também.</w:t>
+      </w:r>
     </w:p>
     <w:p>
       <w:pPr>
@@ -4035,6 +6338,10 @@
     <w:p>
       <w:pPr>
         <w:spacing w:after="0"/>
+        <w:rPr>
+          <w:b/>
+          <w:bCs/>
+        </w:rPr>
       </w:pPr>
       <w:r>
         <w:rPr>
@@ -4043,6 +6350,438 @@
         </w:rPr>
         <w:t xml:space="preserve">13. </w:t>
       </w:r>
+      <w:r>
+        <w:rPr>
+          <w:b/>
+          <w:bCs/>
+        </w:rPr>
+        <w:t>Teste de performance com K6</w:t>
+      </w:r>
+    </w:p>
+    <w:p>
+      <w:pPr>
+        <w:spacing w:after="0"/>
+        <w:rPr>
+          <w:b/>
+          <w:bCs/>
+        </w:rPr>
+      </w:pPr>
+    </w:p>
+    <w:p>
+      <w:pPr>
+        <w:spacing w:after="0"/>
+      </w:pPr>
+      <w:r>
+        <w:t xml:space="preserve">Fala agora sobre como utilizar outro recurso do k 6 chamado </w:t>
+      </w:r>
+      <w:proofErr w:type="spellStart"/>
+      <w:r>
+        <w:t>stages</w:t>
+      </w:r>
+      <w:proofErr w:type="spellEnd"/>
+      <w:r>
+        <w:t xml:space="preserve">. Os </w:t>
+      </w:r>
+      <w:proofErr w:type="spellStart"/>
+      <w:r>
+        <w:t>stages</w:t>
+      </w:r>
+      <w:proofErr w:type="spellEnd"/>
+      <w:r>
+        <w:t xml:space="preserve"> ajudam a gente a definir momentos durante a execução do teste, com relação a quantos usuários virtuais nós queremos e qual é a duração de execução de cada desses estágios durante a execução dos testes. É muito simples usar. A gente </w:t>
+      </w:r>
+      <w:r>
+        <w:lastRenderedPageBreak/>
+        <w:t xml:space="preserve">vai fazer isso agora e depois eu quero explicar pra você conceito que vai ser super importante pra você definir como é que você quer que esses </w:t>
+      </w:r>
+      <w:proofErr w:type="spellStart"/>
+      <w:r>
+        <w:t>stages</w:t>
+      </w:r>
+      <w:proofErr w:type="spellEnd"/>
+      <w:r>
+        <w:t xml:space="preserve"> aconteçam, ok? Então vamos lá, 1º a gente vai </w:t>
+      </w:r>
+      <w:proofErr w:type="spellStart"/>
+      <w:r>
+        <w:t>implementálos</w:t>
+      </w:r>
+      <w:proofErr w:type="spellEnd"/>
+      <w:r>
+        <w:t xml:space="preserve">. Você vai ver que quando a gente implementa os </w:t>
+      </w:r>
+      <w:proofErr w:type="spellStart"/>
+      <w:r>
+        <w:t>stages</w:t>
+      </w:r>
+      <w:proofErr w:type="spellEnd"/>
+      <w:r>
+        <w:t xml:space="preserve">, a gente já não tem mais a questão dos v u, a questão do v u e da </w:t>
+      </w:r>
+      <w:proofErr w:type="spellStart"/>
+      <w:r>
+        <w:t>duration</w:t>
+      </w:r>
+      <w:proofErr w:type="spellEnd"/>
+      <w:r>
+        <w:t xml:space="preserve">. Por quê? Porque a v u e a </w:t>
+      </w:r>
+      <w:proofErr w:type="spellStart"/>
+      <w:r>
+        <w:t>duration</w:t>
+      </w:r>
+      <w:proofErr w:type="spellEnd"/>
+      <w:r>
+        <w:t xml:space="preserve"> passam a ser, então, definidos dentro dos </w:t>
+      </w:r>
+      <w:proofErr w:type="spellStart"/>
+      <w:r>
+        <w:t>stages</w:t>
+      </w:r>
+      <w:proofErr w:type="spellEnd"/>
+      <w:r>
+        <w:t xml:space="preserve">. Ok? Então, a sintaxe é bem simples, bem simples. </w:t>
+      </w:r>
+      <w:proofErr w:type="spellStart"/>
+      <w:r>
+        <w:t>Stages</w:t>
+      </w:r>
+      <w:proofErr w:type="spellEnd"/>
+      <w:r>
+        <w:t xml:space="preserve">, e aí a gente tem aqui 1 lista de objetos, certo? Então aqui tem objeto, 2, 3, e cada objeto tem </w:t>
+      </w:r>
+      <w:proofErr w:type="spellStart"/>
+      <w:r>
+        <w:t>duration</w:t>
+      </w:r>
+      <w:proofErr w:type="spellEnd"/>
+      <w:r>
+        <w:t xml:space="preserve"> e tem target, ok? Então </w:t>
+      </w:r>
+      <w:proofErr w:type="spellStart"/>
+      <w:r>
+        <w:t>stages</w:t>
+      </w:r>
+      <w:proofErr w:type="spellEnd"/>
+      <w:r>
+        <w:t xml:space="preserve">, 1 lista, objetos, então </w:t>
+      </w:r>
+      <w:proofErr w:type="spellStart"/>
+      <w:r>
+        <w:t>duration</w:t>
+      </w:r>
+      <w:proofErr w:type="spellEnd"/>
+      <w:r>
+        <w:t xml:space="preserve"> e targets. </w:t>
+      </w:r>
+      <w:proofErr w:type="spellStart"/>
+      <w:r>
+        <w:t>Julio</w:t>
+      </w:r>
+      <w:proofErr w:type="spellEnd"/>
+      <w:r>
+        <w:t xml:space="preserve">, quantos </w:t>
+      </w:r>
+      <w:proofErr w:type="spellStart"/>
+      <w:r>
+        <w:t>quantos</w:t>
+      </w:r>
+      <w:proofErr w:type="spellEnd"/>
+      <w:r>
+        <w:t xml:space="preserve"> objetos desse eu posso ter? Quantos você quiser, está bom? Pode ter quantos você quiser. Então vamos lá, vamos implementar aqui a questão dos </w:t>
+      </w:r>
+      <w:proofErr w:type="spellStart"/>
+      <w:r>
+        <w:t>stages</w:t>
+      </w:r>
+      <w:proofErr w:type="spellEnd"/>
+      <w:r>
+        <w:t xml:space="preserve">. A gente vai ir lá então pro nosso Visual Studio </w:t>
+      </w:r>
+      <w:proofErr w:type="spellStart"/>
+      <w:r>
+        <w:t>Code</w:t>
+      </w:r>
+      <w:proofErr w:type="spellEnd"/>
+      <w:r>
+        <w:t xml:space="preserve">, </w:t>
+      </w:r>
+      <w:proofErr w:type="gramStart"/>
+      <w:r>
+        <w:t>Eu</w:t>
+      </w:r>
+      <w:proofErr w:type="gramEnd"/>
+      <w:r>
+        <w:t xml:space="preserve"> vou tirar aqui olha, esses nossos v </w:t>
+      </w:r>
+      <w:proofErr w:type="spellStart"/>
+      <w:r>
+        <w:t>u's</w:t>
+      </w:r>
+      <w:proofErr w:type="spellEnd"/>
+      <w:r>
+        <w:t xml:space="preserve"> e </w:t>
+      </w:r>
+      <w:proofErr w:type="spellStart"/>
+      <w:r>
+        <w:t>durations</w:t>
+      </w:r>
+      <w:proofErr w:type="spellEnd"/>
+      <w:r>
+        <w:t xml:space="preserve"> e vou colocar no lugar o </w:t>
+      </w:r>
+      <w:proofErr w:type="spellStart"/>
+      <w:r>
+        <w:t>stages</w:t>
+      </w:r>
+      <w:proofErr w:type="spellEnd"/>
+      <w:r>
+        <w:t xml:space="preserve">. Lembrando que o </w:t>
+      </w:r>
+      <w:proofErr w:type="spellStart"/>
+      <w:r>
+        <w:t>stages</w:t>
+      </w:r>
+      <w:proofErr w:type="spellEnd"/>
+      <w:r>
+        <w:t xml:space="preserve"> ele é vetor né, ou 1 lista aqui, onde a gente aqui dentro vai ter os </w:t>
+      </w:r>
+      <w:proofErr w:type="spellStart"/>
+      <w:r>
+        <w:t>stages</w:t>
+      </w:r>
+      <w:proofErr w:type="spellEnd"/>
+      <w:r>
+        <w:t xml:space="preserve">, que são objetos, que possuem 2 propriedades, </w:t>
+      </w:r>
+      <w:proofErr w:type="spellStart"/>
+      <w:r>
+        <w:t>duration</w:t>
+      </w:r>
+      <w:proofErr w:type="spellEnd"/>
+      <w:r>
+        <w:t xml:space="preserve">, que vai ser 1 </w:t>
+      </w:r>
+      <w:proofErr w:type="spellStart"/>
+      <w:r>
+        <w:t>string</w:t>
+      </w:r>
+      <w:proofErr w:type="spellEnd"/>
+      <w:r>
+        <w:t xml:space="preserve">, e target, que vai ser inteiro, que representa o número de usuários virtuais que a gente quer ter. Se eu quiser ter mais do que </w:t>
+      </w:r>
+      <w:proofErr w:type="spellStart"/>
+      <w:r>
+        <w:t>stage</w:t>
+      </w:r>
+      <w:proofErr w:type="spellEnd"/>
+      <w:r>
+        <w:t xml:space="preserve">, eu coloco 1 vírgula aqui e vou colocando outros que eu quero que eu queira colocar, certo? Vou colocar aqui 3, está bom? Vamos lá, vamos começar a </w:t>
+      </w:r>
+      <w:proofErr w:type="spellStart"/>
+      <w:r>
+        <w:t>setar</w:t>
+      </w:r>
+      <w:proofErr w:type="spellEnd"/>
+      <w:r>
+        <w:t xml:space="preserve"> aqui então algumas durações, alguns targets, está bom? 1º coisa que gente vai fazer aqui é o seguinte olha, nos primeiros 10 segundos eu quero que o k 6 chegue até 10 usuários virtuais. É desse jeito que que a gente faz olha. Durante 10 segundos, coloque 10 usuários virtuais pra executar o meu teste. Aí eu falo, olha, nos próximos 20 segundos, eu quero que continue com 10 usuários lá executando essas ações. Aí eu digo, depois, com 10 segundos, eu quero que você chegue a 30 usuários virtuais. Ou seja, já estava com 10, manteve 10 e agora eu estou pedindo pra ele subir pra 30. E aqui eu vou falar assim, olha, e daí depois de subir pra 30? Eu quero que você mantenha esses 30 por outros 20 segundos. E aí vou falar aqui pra ele agora, depois desses 20 segundos com 30 usuários, eu quero que nos próximos 20 segundos ele caia para 0 usuários. Ok? Então a gente montou aqui esses </w:t>
+      </w:r>
+      <w:proofErr w:type="spellStart"/>
+      <w:r>
+        <w:t>stages</w:t>
+      </w:r>
+      <w:proofErr w:type="spellEnd"/>
+      <w:r>
+        <w:t xml:space="preserve">, esses estágios. Você vê aqui que é 1 forma de você deixar o k 6 seguir 1 determinada estratégia que você definiu e que está refletindo como que os seus usuários se comportam lá na realidade. Ok? Fiz isso daqui, vou vir aqui embaixo e vou selecionar pra rodar esse teste, certo? Então vou vir aqui olha, k 6 dashboard, está aqui tudo certinho, vou dar </w:t>
+      </w:r>
+      <w:proofErr w:type="spellStart"/>
+      <w:r>
+        <w:t>enter</w:t>
+      </w:r>
+      <w:proofErr w:type="spellEnd"/>
+      <w:r>
+        <w:t xml:space="preserve">. E aí. Ele vai começar a rodar, eu posso assistir, execução a partir daqui de clicar nesse link segurando o. Pronto, agora eu já estou aqui no relatório. E aonde a gente vai conseguir ver essa, essa questão dos usuários virtuais? Aqui nesse 2º gráfico aqui, o VUS, a gente já ele vai começar a preencher com o verde olha, VUS, e a gente vai começar a ver aquela escada, aquela escadinha dos </w:t>
+      </w:r>
+      <w:proofErr w:type="spellStart"/>
+      <w:r>
+        <w:t>stages</w:t>
+      </w:r>
+      <w:proofErr w:type="spellEnd"/>
+      <w:r>
+        <w:t xml:space="preserve">, ok? Como se trata de </w:t>
+      </w:r>
+      <w:proofErr w:type="spellStart"/>
+      <w:r>
+        <w:t>de</w:t>
+      </w:r>
+      <w:proofErr w:type="spellEnd"/>
+      <w:r>
+        <w:t xml:space="preserve"> tipo de, de assincronismo, em alguns momentos o número não é exato, tá? Por quê? Porque às vezes ele tenta colocar, por exemplo, 30 usuários virtuais pra que eles fiquem ali naquele determinado momento executando, só que ele não consegue computar corretamente, né? Isso é algo comum, está bom? Mas ele tem internamente a execução pra aqueles usuários. Então, é algo que a gente pode ver aqui às vezes que às vezes pode ter algum tipo de </w:t>
+      </w:r>
+      <w:proofErr w:type="spellStart"/>
+      <w:r>
+        <w:t>de</w:t>
+      </w:r>
+      <w:proofErr w:type="spellEnd"/>
+      <w:r>
+        <w:t xml:space="preserve"> </w:t>
+      </w:r>
+      <w:proofErr w:type="spellStart"/>
+      <w:r>
+        <w:t>de</w:t>
+      </w:r>
+      <w:proofErr w:type="spellEnd"/>
+      <w:r>
+        <w:t xml:space="preserve"> atraso quanto a colocar todos os usuários pra estarem juntos e isso causa algumas mudanças no gráfico. Mas o número, no final das contas, ele permanece, ele chega ali naquele </w:t>
+      </w:r>
+      <w:proofErr w:type="spellStart"/>
+      <w:r>
+        <w:t>naquele</w:t>
+      </w:r>
+      <w:proofErr w:type="spellEnd"/>
+      <w:r>
+        <w:t xml:space="preserve"> topo onde a gente gostaria, está bom? Mas essa questão das transições entre número de usuários acaba às vezes atrasando pouco, fazendo com que o gráfico fique diferente. Bem, aqui já gerou o gráfico, deixa eu olhar aqui para saber se já terminou a execução dos testes, vai lá. Ele já tem aqui todos os testes executados e agora ele está ainda parando aqui esses usuários, tá? É isso demora às vezes alguns segundos quando a gente deixa rodando muito tempo, mas se eu venho aqui olha, eu já consigo ver aquela escadinha como a gente tinha desenhado, está vendo olha? Então ele começou aqui colocando o número de 10 usuários, depois num determinado momento ele subiu aqui o número pra pros 30 usuários, e aí ele permaneceu a execução por alguns segundos, e depois já começou a derrubar esses usuários pra chegar até no 0, né. Então é isso daqui que a gente tem como sendo, deixa eu colocar aqui só o verdinho olha, tirar o azul, vai ficar mais fácil pra </w:t>
+      </w:r>
+      <w:r>
+        <w:lastRenderedPageBreak/>
+        <w:t xml:space="preserve">você. Isso daqui é o que a gente tem como sendo essas estratégias de execução com o k 6. Quanto mais quanto mais duradouro é a execução, a duradouro é a execução dos testes, quanto mais a duração </w:t>
+      </w:r>
+      <w:proofErr w:type="gramStart"/>
+      <w:r>
+        <w:t>é</w:t>
+      </w:r>
+      <w:proofErr w:type="gramEnd"/>
+      <w:r>
+        <w:t xml:space="preserve"> </w:t>
+      </w:r>
+      <w:proofErr w:type="spellStart"/>
+      <w:r>
+        <w:t>é</w:t>
+      </w:r>
+      <w:proofErr w:type="spellEnd"/>
+      <w:r>
+        <w:t xml:space="preserve"> elevada, mais você consegue ver esse gráfico ficando </w:t>
+      </w:r>
+      <w:proofErr w:type="gramStart"/>
+      <w:r>
+        <w:t>mais</w:t>
+      </w:r>
+      <w:proofErr w:type="gramEnd"/>
+      <w:r>
+        <w:t xml:space="preserve"> </w:t>
+      </w:r>
+      <w:proofErr w:type="spellStart"/>
+      <w:r>
+        <w:t>mais</w:t>
+      </w:r>
+      <w:proofErr w:type="spellEnd"/>
+      <w:r>
+        <w:t xml:space="preserve"> perfeitinho, mais certinho 2º os </w:t>
+      </w:r>
+      <w:proofErr w:type="spellStart"/>
+      <w:r>
+        <w:t>stages</w:t>
+      </w:r>
+      <w:proofErr w:type="spellEnd"/>
+      <w:r>
+        <w:t xml:space="preserve"> que você organizou, ok? Mas daqui já dá pra ver essa inteligência que o k 6 tem. Esse tipo de recurso, por exemplo, você não tem no </w:t>
+      </w:r>
+      <w:proofErr w:type="spellStart"/>
+      <w:r>
+        <w:t>JMeter</w:t>
+      </w:r>
+      <w:proofErr w:type="spellEnd"/>
+      <w:r>
+        <w:t xml:space="preserve">, que é 1 ferramenta muito conhecida no mercado, né, não tem essa </w:t>
+      </w:r>
+      <w:proofErr w:type="spellStart"/>
+      <w:r>
+        <w:t>essa</w:t>
+      </w:r>
+      <w:proofErr w:type="spellEnd"/>
+      <w:r>
+        <w:t xml:space="preserve"> inteligência desses estágios, a gente acaba fazendo algumas gambiarras lá pra conseguir chegar perto disso, né, mas é algo muito bacana também, ok? Pra que que é isso daqui? Pra simular o usuário. </w:t>
+      </w:r>
+      <w:proofErr w:type="spellStart"/>
+      <w:r>
+        <w:t>Julio</w:t>
+      </w:r>
+      <w:proofErr w:type="spellEnd"/>
+      <w:r>
+        <w:t xml:space="preserve">, eu tenho que colocar sempre essa quantidade aqui, esses números? Não, você faz do jeitinho que você quiser. Do jeito que você quiser você vem aqui e configura isso e ele vai </w:t>
+      </w:r>
+      <w:proofErr w:type="gramStart"/>
+      <w:r>
+        <w:t>obedecer também essa</w:t>
+      </w:r>
+      <w:proofErr w:type="gramEnd"/>
+      <w:r>
+        <w:t xml:space="preserve"> execução, ok? Então está aqui os </w:t>
+      </w:r>
+      <w:proofErr w:type="spellStart"/>
+      <w:r>
+        <w:t>stages</w:t>
+      </w:r>
+      <w:proofErr w:type="spellEnd"/>
+      <w:r>
+        <w:t xml:space="preserve">, tá? Agora, 1 coisa que você tem que entender é que os </w:t>
+      </w:r>
+      <w:proofErr w:type="spellStart"/>
+      <w:r>
+        <w:t>stages</w:t>
+      </w:r>
+      <w:proofErr w:type="spellEnd"/>
+      <w:r>
+        <w:t xml:space="preserve"> eles são utilizados para que você reflita algo que a gente chama de tipos de teste ou estratégias de teste quando a gente fala de performance, ok? São através das estratégias que a gente pode definir como é que a gente vai preparar os </w:t>
+      </w:r>
+      <w:proofErr w:type="spellStart"/>
+      <w:r>
+        <w:t>stages</w:t>
+      </w:r>
+      <w:proofErr w:type="spellEnd"/>
+      <w:r>
+        <w:t xml:space="preserve"> aqui. Então, eu queria mostrar aqui pra você que, dentro do próprio site do k 6, se você vier aqui olha, em, deixa eu ver aqui, </w:t>
+      </w:r>
+      <w:proofErr w:type="spellStart"/>
+      <w:r>
+        <w:t>testing</w:t>
+      </w:r>
+      <w:proofErr w:type="spellEnd"/>
+      <w:r>
+        <w:t xml:space="preserve"> </w:t>
+      </w:r>
+      <w:proofErr w:type="spellStart"/>
+      <w:r>
+        <w:t>guides</w:t>
+      </w:r>
+      <w:proofErr w:type="spellEnd"/>
+      <w:r>
+        <w:t xml:space="preserve">, </w:t>
+      </w:r>
+      <w:proofErr w:type="spellStart"/>
+      <w:r>
+        <w:t>low</w:t>
+      </w:r>
+      <w:proofErr w:type="spellEnd"/>
+      <w:r>
+        <w:t xml:space="preserve"> </w:t>
+      </w:r>
+      <w:proofErr w:type="spellStart"/>
+      <w:r>
+        <w:t>test</w:t>
+      </w:r>
+      <w:proofErr w:type="spellEnd"/>
+      <w:r>
+        <w:t xml:space="preserve"> </w:t>
+      </w:r>
+      <w:proofErr w:type="spellStart"/>
+      <w:r>
+        <w:t>types</w:t>
+      </w:r>
+      <w:proofErr w:type="spellEnd"/>
+      <w:r>
+        <w:t>. Você vai ter aqui olha, quais</w:t>
+      </w:r>
     </w:p>
     <w:p>
       <w:pPr>
@@ -4056,7 +6795,10 @@
     </w:p>
     <w:p>
       <w:pPr>
-        <w:spacing w:after="0"/>
+        <w:rPr>
+          <w:b/>
+          <w:bCs/>
+        </w:rPr>
       </w:pPr>
       <w:r>
         <w:rPr>
@@ -4070,7 +6812,7 @@
           <w:b/>
           <w:bCs/>
         </w:rPr>
-        <w:t>4</w:t>
+        <w:t>5</w:t>
       </w:r>
       <w:r>
         <w:rPr>
@@ -4079,6 +6821,483 @@
         </w:rPr>
         <w:t xml:space="preserve">. </w:t>
       </w:r>
+      <w:r>
+        <w:rPr>
+          <w:b/>
+          <w:bCs/>
+        </w:rPr>
+        <w:t>Segregando arquivos de dados do teste</w:t>
+      </w:r>
+    </w:p>
+    <w:p>
+      <w:pPr>
+        <w:spacing w:after="0"/>
+      </w:pPr>
+      <w:r>
+        <w:t xml:space="preserve">Bem, nessa aula eu quero mostrar pra você como aplicar 1 das boas práticas que nós temos em automação de testes, que é você ter o modelo dos seus bares da requisição que você vai fazer nos seus testes automatizados pra API sendo colocado em arquivo externo. A gente chama esse arquivo externo de 1, vai ser ali dados de entrada para o seu teste automatizado. Ele serve tanto como modelo como sendo de fato massa de dados, ok? Bem, a gente vai fazer isso da seguinte forma, está vendo aqui olha esse objeto que nós estamos passando dentro desse dessa nossa requisição aqui pra </w:t>
+      </w:r>
+      <w:proofErr w:type="spellStart"/>
+      <w:r>
+        <w:t>pra</w:t>
+      </w:r>
+      <w:proofErr w:type="spellEnd"/>
+      <w:r>
+        <w:t xml:space="preserve"> </w:t>
+      </w:r>
+      <w:proofErr w:type="spellStart"/>
+      <w:r>
+        <w:t>request</w:t>
+      </w:r>
+      <w:proofErr w:type="spellEnd"/>
+      <w:r>
+        <w:t xml:space="preserve">? Esse objeto ele representa aqui 1 o 0 corpo, né, da nossa requisição via post para o login. Então a gente vai pegar esse elemento aqui, e vai jogar dentro de arquivo, dentro de 1 pasta que nós vamos criar chamada </w:t>
+      </w:r>
+      <w:proofErr w:type="spellStart"/>
+      <w:r>
+        <w:t>fixtures</w:t>
+      </w:r>
+      <w:proofErr w:type="spellEnd"/>
+      <w:r>
+        <w:t xml:space="preserve">, ok? E aí estando lá dentro a gente vai importar esse arquivo pra cá e vai passar aqui dentro esse objeto. Beleza? Vamos fazer isso então? A gente vai construir aqui então, clicando com o botão direito em new folder, 1 nova pasta chamada </w:t>
+      </w:r>
+      <w:proofErr w:type="spellStart"/>
+      <w:r>
+        <w:t>fixtures</w:t>
+      </w:r>
+      <w:proofErr w:type="spellEnd"/>
+      <w:r>
+        <w:t xml:space="preserve">. E dentro dessa pasta </w:t>
+      </w:r>
+      <w:proofErr w:type="spellStart"/>
+      <w:r>
+        <w:t>fixtures</w:t>
+      </w:r>
+      <w:proofErr w:type="spellEnd"/>
+      <w:r>
+        <w:t xml:space="preserve"> a gente vai criar arquivo, que vai ser o arquivo post login ponto JSON. Como se trata de JSON, ele não vai não vai poder ser reaproveitado 100 por 100 aqui porque esse formato de objeto que você está vendo aqui é objeto </w:t>
+      </w:r>
+      <w:proofErr w:type="spellStart"/>
+      <w:r>
+        <w:t>JavaScript</w:t>
+      </w:r>
+      <w:proofErr w:type="spellEnd"/>
+      <w:r>
+        <w:t xml:space="preserve">. Esse objeto </w:t>
+      </w:r>
+      <w:proofErr w:type="spellStart"/>
+      <w:r>
+        <w:t>JavaScript</w:t>
+      </w:r>
+      <w:proofErr w:type="spellEnd"/>
+      <w:r>
+        <w:t xml:space="preserve"> ele parece com JSON, mas ele tem diferenças. Vou copiar </w:t>
+      </w:r>
+      <w:proofErr w:type="gramStart"/>
+      <w:r>
+        <w:t>daqui, jogar</w:t>
+      </w:r>
+      <w:proofErr w:type="gramEnd"/>
+      <w:r>
+        <w:t xml:space="preserve"> lá só pra você entender de fato quais são as diferenças. 1º, a diferença entre objeto </w:t>
+      </w:r>
+      <w:proofErr w:type="spellStart"/>
+      <w:r>
+        <w:t>JavaScript</w:t>
+      </w:r>
+      <w:proofErr w:type="spellEnd"/>
+      <w:r>
+        <w:t xml:space="preserve"> e JSON, a 1º delas é que as propriedades, no caso aqui </w:t>
+      </w:r>
+      <w:proofErr w:type="spellStart"/>
+      <w:r>
+        <w:t>username</w:t>
+      </w:r>
+      <w:proofErr w:type="spellEnd"/>
+      <w:r>
+        <w:t xml:space="preserve">, por exemplo, ela vai ter aspas duplas, não vai ser solta, ok? Os valores também são com aspas duplas, não são com aspas simples, ok? Então essa daqui é a principal diferença aí entre objeto </w:t>
+      </w:r>
+      <w:proofErr w:type="spellStart"/>
+      <w:r>
+        <w:t>JavaScript</w:t>
+      </w:r>
+      <w:proofErr w:type="spellEnd"/>
+      <w:r>
+        <w:t xml:space="preserve"> e JSON. Então eu estou fazendo essas alterações aqui. Veja que aqui a gente ficou com 1 </w:t>
+      </w:r>
+      <w:proofErr w:type="spellStart"/>
+      <w:r>
+        <w:t>identação</w:t>
+      </w:r>
+      <w:proofErr w:type="spellEnd"/>
+      <w:r>
+        <w:t xml:space="preserve"> meio estranha, né? Botão direito, </w:t>
+      </w:r>
+      <w:proofErr w:type="spellStart"/>
+      <w:r>
+        <w:t>format</w:t>
+      </w:r>
+      <w:proofErr w:type="spellEnd"/>
+      <w:r>
+        <w:t xml:space="preserve"> </w:t>
+      </w:r>
+      <w:proofErr w:type="spellStart"/>
+      <w:r>
+        <w:t>document</w:t>
+      </w:r>
+      <w:proofErr w:type="spellEnd"/>
+      <w:r>
+        <w:t xml:space="preserve">, e aí as coisas se alinham, está tudo belezinha pra gente, ok? Salvei. Vou vir aqui agora dentro do meu arquivo de teste, </w:t>
+      </w:r>
+      <w:proofErr w:type="spellStart"/>
+      <w:r>
+        <w:t>lembrese</w:t>
+      </w:r>
+      <w:proofErr w:type="spellEnd"/>
+      <w:r>
+        <w:t xml:space="preserve"> que o objetivo é substituir esse objeto em </w:t>
+      </w:r>
+      <w:proofErr w:type="spellStart"/>
+      <w:r>
+        <w:t>JavaScript</w:t>
+      </w:r>
+      <w:proofErr w:type="spellEnd"/>
+      <w:r>
+        <w:t xml:space="preserve"> aqui. Então, vou vir aqui na parte de cima e vou colocar assim olha, </w:t>
+      </w:r>
+      <w:proofErr w:type="spellStart"/>
+      <w:r>
+        <w:t>const</w:t>
+      </w:r>
+      <w:proofErr w:type="spellEnd"/>
+      <w:r>
+        <w:t xml:space="preserve">, que eu estou criando 1 constante, vou chamar de post login, não tem porque não mudar, né. Vou vir aqui e vou colocar isso daqui olha, open. E esse, e essa função open serve pra puxar a informação que tem dentro de arquivo, objeto em </w:t>
+      </w:r>
+      <w:proofErr w:type="spellStart"/>
+      <w:r>
+        <w:t>JavaScript</w:t>
+      </w:r>
+      <w:proofErr w:type="spellEnd"/>
+      <w:r>
+        <w:t xml:space="preserve">. Agora sim, o que tem aqui dentro do, fazer agora, venho aqui olha, e troco esse objeto que a gente tinha aqui, pela variável post login, agora sim está certinho, entendeu? Então é bem simples, fiz isso </w:t>
+      </w:r>
+      <w:proofErr w:type="gramStart"/>
+      <w:r>
+        <w:t>daqui, preciso</w:t>
+      </w:r>
+      <w:proofErr w:type="gramEnd"/>
+      <w:r>
+        <w:t xml:space="preserve"> mudar mais nada, já está pronto, já está implementado já, mas Júlio, eu quero testar. O que que você faz? Vem aqui olha e comenta esses </w:t>
+      </w:r>
+      <w:proofErr w:type="spellStart"/>
+      <w:r>
+        <w:t>stages</w:t>
+      </w:r>
+      <w:proofErr w:type="spellEnd"/>
+      <w:r>
+        <w:t xml:space="preserve">, por quê? Porque você sabe que o </w:t>
+      </w:r>
+      <w:proofErr w:type="spellStart"/>
+      <w:r>
+        <w:t>stages</w:t>
+      </w:r>
+      <w:proofErr w:type="spellEnd"/>
+      <w:r>
+        <w:t xml:space="preserve"> vai demorar ali pelo menos 30 segundos, 5 mais 20 mais 5, ah, é isso que a gente quer. Vamos ver aqui olha. Vou comentar essa parte. E aqui eu vou colocar aquele </w:t>
+      </w:r>
+      <w:proofErr w:type="spellStart"/>
+      <w:r>
+        <w:lastRenderedPageBreak/>
+        <w:t>iterations</w:t>
+      </w:r>
+      <w:proofErr w:type="spellEnd"/>
+      <w:r>
+        <w:t xml:space="preserve">, né, do lado </w:t>
+      </w:r>
+      <w:proofErr w:type="spellStart"/>
+      <w:r>
+        <w:t>iterations</w:t>
+      </w:r>
+      <w:proofErr w:type="spellEnd"/>
+      <w:r>
+        <w:t xml:space="preserve">? Vamos colocar 1 só, vírgula. Por quê? Porque a gente quer que ele roda apenas 1 vez, só pra gente ver o que que vai acontecer. E agora o que que a gente vai fazer? A gente vai vir aqui olha, logo aqui olha, antes do </w:t>
+      </w:r>
+      <w:proofErr w:type="spellStart"/>
+      <w:r>
+        <w:t>do</w:t>
+      </w:r>
+      <w:proofErr w:type="spellEnd"/>
+      <w:r>
+        <w:t xml:space="preserve"> post </w:t>
+      </w:r>
+      <w:proofErr w:type="spellStart"/>
+      <w:r>
+        <w:t>payload</w:t>
+      </w:r>
+      <w:proofErr w:type="spellEnd"/>
+      <w:r>
+        <w:t xml:space="preserve">, vamos fazer console ponto log. E vamos colocar aqui dentro, pra você conseguir ver o que vem aqui dentro, né? Vou vir aqui agora e vou rodar o teste. Subir aqui olha, pra você poder enxergar. Olha só, ele mostrou aqui pra gente olha, que o objeto foi aqui olha, apresentado pra nós, está vendo? Não está aqui pra gente. Então, o que aconteceu aqui? Ele de fato conseguiu fazer essa </w:t>
+      </w:r>
+      <w:proofErr w:type="spellStart"/>
+      <w:proofErr w:type="gramStart"/>
+      <w:r>
+        <w:t>essa</w:t>
+      </w:r>
+      <w:proofErr w:type="spellEnd"/>
+      <w:r>
+        <w:t xml:space="preserve"> esse uso</w:t>
+      </w:r>
+      <w:proofErr w:type="gramEnd"/>
+      <w:r>
+        <w:t xml:space="preserve"> desse arquivo que está lá dentro do </w:t>
+      </w:r>
+      <w:proofErr w:type="spellStart"/>
+      <w:r>
+        <w:t>fixtures</w:t>
+      </w:r>
+      <w:proofErr w:type="spellEnd"/>
+      <w:r>
+        <w:t xml:space="preserve">. Qualquer tipo de corpo que você tiver de requisição, joga lá dentro do </w:t>
+      </w:r>
+      <w:proofErr w:type="spellStart"/>
+      <w:r>
+        <w:t>fixtures</w:t>
+      </w:r>
+      <w:proofErr w:type="spellEnd"/>
+      <w:r>
+        <w:t xml:space="preserve">. Mas </w:t>
+      </w:r>
+      <w:proofErr w:type="spellStart"/>
+      <w:r>
+        <w:t>Julio</w:t>
+      </w:r>
+      <w:proofErr w:type="spellEnd"/>
+      <w:r>
+        <w:t xml:space="preserve">, e se eu quisesse agora mudar o valor do </w:t>
+      </w:r>
+      <w:proofErr w:type="spellStart"/>
+      <w:r>
+        <w:t>username</w:t>
+      </w:r>
+      <w:proofErr w:type="spellEnd"/>
+      <w:r>
+        <w:t xml:space="preserve"> que está aqui dentro só pra esse teste </w:t>
+      </w:r>
+      <w:proofErr w:type="spellStart"/>
+      <w:r>
+        <w:t>Julio</w:t>
+      </w:r>
+      <w:proofErr w:type="spellEnd"/>
+      <w:r>
+        <w:t xml:space="preserve">? Como eu faria isso? Fácil, você vem aqui olha, e coloca assim olha, post login ponto </w:t>
+      </w:r>
+      <w:proofErr w:type="spellStart"/>
+      <w:r>
+        <w:t>username</w:t>
+      </w:r>
+      <w:proofErr w:type="spellEnd"/>
+      <w:r>
+        <w:t xml:space="preserve">, que é o nome da propriedade que está lá dentro, recebe e aí você coloca aqui o usuário olha, vamos colocar assim olha, Júnior ponto Lima, beleza? Está lá. Aqui o nosso post login agora já vai estar alterado com o </w:t>
+      </w:r>
+      <w:proofErr w:type="spellStart"/>
+      <w:r>
+        <w:t>username</w:t>
+      </w:r>
+      <w:proofErr w:type="spellEnd"/>
+      <w:r>
+        <w:t xml:space="preserve">, está vendo? Vou vir aqui, </w:t>
+      </w:r>
+      <w:proofErr w:type="gramStart"/>
+      <w:r>
+        <w:t>vou</w:t>
+      </w:r>
+      <w:proofErr w:type="gramEnd"/>
+      <w:r>
+        <w:t xml:space="preserve"> </w:t>
+      </w:r>
+      <w:proofErr w:type="spellStart"/>
+      <w:r>
+        <w:t>vou</w:t>
+      </w:r>
+      <w:proofErr w:type="spellEnd"/>
+      <w:r>
+        <w:t xml:space="preserve"> executar. Olha só o que aconteceu aqui olha. Ele trouxe pra gente o </w:t>
+      </w:r>
+      <w:proofErr w:type="spellStart"/>
+      <w:r>
+        <w:t>username</w:t>
+      </w:r>
+      <w:proofErr w:type="spellEnd"/>
+      <w:r>
+        <w:t xml:space="preserve"> agora Júnior ponto Lima. Ah, Júlio, então esse daqui mudou lá dentro do JSON? Não, olha só, o JSON aqui continua normal como o Júlio ponto Lima, você pode manipular as informações. Pode manipular tanto pro </w:t>
+      </w:r>
+      <w:proofErr w:type="spellStart"/>
+      <w:r>
+        <w:t>pro</w:t>
+      </w:r>
+      <w:proofErr w:type="spellEnd"/>
+      <w:r>
+        <w:t xml:space="preserve"> nome quanto pro pra senha também, afinal essas informações estão lá dentro, ok? Beleza. Então, Júlio, espera aí, aqui tinha </w:t>
+      </w:r>
+      <w:proofErr w:type="gramStart"/>
+      <w:r>
+        <w:t>aquele questão</w:t>
+      </w:r>
+      <w:proofErr w:type="gramEnd"/>
+      <w:r>
+        <w:t xml:space="preserve"> de 200. É, o Júnior ponto Lima de fato existe dentro do banco de dados, está bom? Mas poderia mudar o quanto eu quiser aqui. Por exemplo, se eu viesse aqui e colocasse Júnior ponto Lima, existe esse usuário, aqui a gente já teria que ter outro valor, 1 outra status que não é 200 e é claro, não vai trazer o, está bom? Vamos tentar. Vou vir aqui olha, pra cima, </w:t>
+      </w:r>
+      <w:proofErr w:type="spellStart"/>
+      <w:r>
+        <w:t>enter</w:t>
+      </w:r>
+      <w:proofErr w:type="spellEnd"/>
+      <w:r>
+        <w:t xml:space="preserve">. Olha só. Ele já viu aqui olha, que o resultado não é 200, já viu aqui que o não é e olha só, já teve aqui por, pelo menos por 100 de falha, por quê? Porque o não foi 200 dessa vez, certo? Status não foi 200, logo a gente teve aqui olha, cadê a quantidade de falhas? Aqui, HTTP 100 por 100, está vendo? Por quê? Porque a gente chamou 1 vez, e nessa chamada ele não trouxe o valor correto, ok? O status </w:t>
+      </w:r>
+      <w:proofErr w:type="spellStart"/>
+      <w:r>
+        <w:t>code</w:t>
+      </w:r>
+      <w:proofErr w:type="spellEnd"/>
+      <w:r>
+        <w:t xml:space="preserve"> não foi correto. O status </w:t>
+      </w:r>
+      <w:proofErr w:type="spellStart"/>
+      <w:r>
+        <w:t>code</w:t>
+      </w:r>
+      <w:proofErr w:type="spellEnd"/>
+      <w:r>
+        <w:t xml:space="preserve"> aqui provavelmente foi 200, foi o 400 e porque não conseguiu ser autenticado, afinal o Junior Lima não existe, não existe, está bom? Vou colocar aqui Junior Lima, vou rodar mais 1 vez só pra você ver que passa. Sucesso. A gente já tem aqui o que a gente precisa nesse teste. Beleza? Então, isso daqui foi como extrair essas informações lá pra </w:t>
+      </w:r>
+      <w:proofErr w:type="spellStart"/>
+      <w:r>
+        <w:t>pra</w:t>
+      </w:r>
+      <w:proofErr w:type="spellEnd"/>
+      <w:r>
+        <w:t xml:space="preserve"> esse arquivo externo. Na nossa próxima aula, a gente vai aprender mais recurso de como você consegue ir melhorando os seus testes. Por hora, o que que a gente vai fazer? A gente vai, vamos deixar, vamos </w:t>
+      </w:r>
+      <w:proofErr w:type="spellStart"/>
+      <w:r>
+        <w:t>descomentar</w:t>
+      </w:r>
+      <w:proofErr w:type="spellEnd"/>
+      <w:r>
+        <w:t xml:space="preserve"> aqui esse carinha. A gente vai </w:t>
+      </w:r>
+      <w:proofErr w:type="spellStart"/>
+      <w:r>
+        <w:t>versionar</w:t>
+      </w:r>
+      <w:proofErr w:type="spellEnd"/>
+      <w:r>
+        <w:t xml:space="preserve"> o nosso código agora. Então, vou vir aqui, vou fazer </w:t>
+      </w:r>
+      <w:proofErr w:type="spellStart"/>
+      <w:r>
+        <w:t>git</w:t>
+      </w:r>
+      <w:proofErr w:type="spellEnd"/>
+      <w:r>
+        <w:t xml:space="preserve"> status. Aqui olha, nosso arquivo alterado e a nossa pasta de </w:t>
+      </w:r>
+      <w:proofErr w:type="spellStart"/>
+      <w:r>
+        <w:t>fixtures</w:t>
+      </w:r>
+      <w:proofErr w:type="spellEnd"/>
+      <w:r>
+        <w:t xml:space="preserve">. Vou vir aqui fazer </w:t>
+      </w:r>
+      <w:proofErr w:type="spellStart"/>
+      <w:r>
+        <w:t>git</w:t>
+      </w:r>
+      <w:proofErr w:type="spellEnd"/>
+      <w:r>
+        <w:t xml:space="preserve"> </w:t>
+      </w:r>
+      <w:proofErr w:type="spellStart"/>
+      <w:r>
+        <w:t>add</w:t>
+      </w:r>
+      <w:proofErr w:type="spellEnd"/>
+      <w:r>
+        <w:t xml:space="preserve"> ponto, adicionar ambos. </w:t>
+      </w:r>
+      <w:proofErr w:type="spellStart"/>
+      <w:r>
+        <w:t>Git</w:t>
+      </w:r>
+      <w:proofErr w:type="spellEnd"/>
+      <w:r>
+        <w:t xml:space="preserve"> status novamente, estão lá os 2. Vou fazer </w:t>
+      </w:r>
+      <w:proofErr w:type="spellStart"/>
+      <w:r>
+        <w:t>git</w:t>
+      </w:r>
+      <w:proofErr w:type="spellEnd"/>
+      <w:r>
+        <w:t xml:space="preserve"> </w:t>
+      </w:r>
+      <w:proofErr w:type="spellStart"/>
+      <w:r>
+        <w:t>commit</w:t>
+      </w:r>
+      <w:proofErr w:type="spellEnd"/>
+      <w:r>
+        <w:t xml:space="preserve">, menos m, falando que eu adicionei </w:t>
+      </w:r>
+      <w:proofErr w:type="spellStart"/>
+      <w:r>
+        <w:t>fixtures</w:t>
+      </w:r>
+      <w:proofErr w:type="spellEnd"/>
+      <w:r>
+        <w:t xml:space="preserve"> para os dados de entrada do teste. Ok? Belezura. Vou vir aqui agora e vou fazer </w:t>
+      </w:r>
+      <w:proofErr w:type="spellStart"/>
+      <w:r>
+        <w:t>git</w:t>
+      </w:r>
+      <w:proofErr w:type="spellEnd"/>
+      <w:r>
+        <w:t xml:space="preserve"> </w:t>
+      </w:r>
+      <w:proofErr w:type="spellStart"/>
+      <w:r>
+        <w:t>push</w:t>
+      </w:r>
+      <w:proofErr w:type="spellEnd"/>
+      <w:r>
+        <w:t xml:space="preserve"> pra </w:t>
+      </w:r>
+      <w:proofErr w:type="spellStart"/>
+      <w:r>
+        <w:t>auditing</w:t>
+      </w:r>
+      <w:proofErr w:type="spellEnd"/>
+      <w:r>
+        <w:t xml:space="preserve">, que é a nossa </w:t>
+      </w:r>
+      <w:proofErr w:type="spellStart"/>
+      <w:r>
+        <w:t>branch</w:t>
+      </w:r>
+      <w:proofErr w:type="spellEnd"/>
+      <w:r>
+        <w:t xml:space="preserve">. E tudo já está </w:t>
+      </w:r>
+      <w:proofErr w:type="spellStart"/>
+      <w:r>
+        <w:t>versionado</w:t>
+      </w:r>
+      <w:proofErr w:type="spellEnd"/>
+      <w:r>
+        <w:t>. Agora sim a gente pode ir pra próxima aula.</w:t>
+      </w:r>
     </w:p>
     <w:p>
       <w:pPr>
@@ -4089,6 +7308,47 @@
           <v:rect id="_x0000_i1043" style="width:0;height:1.5pt" o:hralign="center" o:bullet="t" o:hrstd="t" o:hr="t" fillcolor="#a0a0a0" stroked="f"/>
         </w:pict>
       </w:r>
+    </w:p>
+    <w:p>
+      <w:pPr>
+        <w:rPr>
+          <w:b/>
+          <w:bCs/>
+        </w:rPr>
+      </w:pPr>
+      <w:r>
+        <w:rPr>
+          <w:b/>
+          <w:bCs/>
+        </w:rPr>
+        <w:t>1</w:t>
+      </w:r>
+      <w:r>
+        <w:rPr>
+          <w:b/>
+          <w:bCs/>
+        </w:rPr>
+        <w:t>6</w:t>
+      </w:r>
+      <w:r>
+        <w:rPr>
+          <w:b/>
+          <w:bCs/>
+        </w:rPr>
+        <w:t xml:space="preserve">. </w:t>
+      </w:r>
+      <w:r>
+        <w:rPr>
+          <w:b/>
+          <w:bCs/>
+        </w:rPr>
+        <w:t>Reaproveitando código e usando o token</w:t>
+      </w:r>
+    </w:p>
+    <w:p>
+      <w:pPr>
+        <w:spacing w:after="0"/>
+      </w:pPr>
     </w:p>
     <w:p>
       <w:pPr>
@@ -4099,6 +7359,99 @@
         </w:rPr>
       </w:pPr>
       <w:r>
+        <w:pict w14:anchorId="5E4BBF1E">
+          <v:rect id="_x0000_i1046" style="width:0;height:1.5pt" o:bullet="t" o:hrstd="t" o:hr="t" fillcolor="#a0a0a0" stroked="f"/>
+        </w:pict>
+      </w:r>
+    </w:p>
+    <w:p>
+      <w:pPr>
+        <w:spacing w:after="0"/>
+      </w:pPr>
+      <w:r>
+        <w:rPr>
+          <w:b/>
+          <w:bCs/>
+        </w:rPr>
+        <w:t xml:space="preserve">14. </w:t>
+      </w:r>
+    </w:p>
+    <w:p>
+      <w:pPr>
+        <w:spacing w:after="0"/>
+        <w:rPr>
+          <w:b/>
+          <w:bCs/>
+        </w:rPr>
+      </w:pPr>
+      <w:r>
+        <w:pict w14:anchorId="2D1EBEBC">
+          <v:rect id="_x0000_i1048" style="width:0;height:1.5pt" o:bullet="t" o:hrstd="t" o:hr="t" fillcolor="#a0a0a0" stroked="f"/>
+        </w:pict>
+      </w:r>
+    </w:p>
+    <w:p>
+      <w:pPr>
+        <w:spacing w:after="0"/>
+      </w:pPr>
+      <w:r>
+        <w:rPr>
+          <w:b/>
+          <w:bCs/>
+        </w:rPr>
+        <w:t xml:space="preserve">14. </w:t>
+      </w:r>
+    </w:p>
+    <w:p>
+      <w:pPr>
+        <w:spacing w:after="0"/>
+        <w:rPr>
+          <w:b/>
+          <w:bCs/>
+        </w:rPr>
+      </w:pPr>
+      <w:r>
+        <w:pict w14:anchorId="2CBF6D6D">
+          <v:rect id="_x0000_i1050" style="width:0;height:1.5pt" o:bullet="t" o:hrstd="t" o:hr="t" fillcolor="#a0a0a0" stroked="f"/>
+        </w:pict>
+      </w:r>
+    </w:p>
+    <w:p>
+      <w:pPr>
+        <w:spacing w:after="0"/>
+      </w:pPr>
+      <w:r>
+        <w:rPr>
+          <w:b/>
+          <w:bCs/>
+        </w:rPr>
+        <w:t xml:space="preserve">14. </w:t>
+      </w:r>
+    </w:p>
+    <w:p>
+      <w:pPr>
+        <w:spacing w:after="0"/>
+        <w:rPr>
+          <w:b/>
+          <w:bCs/>
+          <w:u w:val="single"/>
+        </w:rPr>
+      </w:pPr>
+      <w:r>
+        <w:pict w14:anchorId="356A04D0">
+          <v:rect id="_x0000_i1052" style="width:0;height:1.5pt" o:bullet="t" o:hrstd="t" o:hr="t" fillcolor="#a0a0a0" stroked="f"/>
+        </w:pict>
+      </w:r>
+    </w:p>
+    <w:p>
+      <w:pPr>
+        <w:spacing w:after="0"/>
+        <w:rPr>
+          <w:b/>
+          <w:bCs/>
+        </w:rPr>
+      </w:pPr>
+      <w:r>
         <w:rPr>
           <w:b/>
           <w:bCs/>
@@ -4118,6 +7471,7 @@
         <w:spacing w:after="0"/>
       </w:pPr>
       <w:r>
+        <w:lastRenderedPageBreak/>
         <w:pict w14:anchorId="3AE0A69E">
           <v:rect id="_x0000_i1044" style="width:0;height:1.5pt" o:hralign="center" o:bullet="t" o:hrstd="t" o:hr="t" fillcolor="#a0a0a0" stroked="f"/>
         </w:pict>

</xml_diff>